<commit_message>
tabla excel de generacion de de estiercol
</commit_message>
<xml_diff>
--- a/prosas/met/TFG_ACV_Estiercol_MASTER_feb - Copy.docx
+++ b/prosas/met/TFG_ACV_Estiercol_MASTER_feb - Copy.docx
@@ -279,25 +279,7 @@
           <w:sz w:val="24"/>
           <w:szCs w:val="24"/>
         </w:rPr>
-        <w:t xml:space="preserve">, </w:t>
-      </w:r>
-      <w:proofErr w:type="spellStart"/>
-      <w:r>
-        <w:rPr>
-          <w:color w:val="000000"/>
-          <w:sz w:val="24"/>
-          <w:szCs w:val="24"/>
-        </w:rPr>
-        <w:t>Ph.D</w:t>
-      </w:r>
-      <w:proofErr w:type="spellEnd"/>
-      <w:r>
-        <w:rPr>
-          <w:color w:val="000000"/>
-          <w:sz w:val="24"/>
-          <w:szCs w:val="24"/>
-        </w:rPr>
-        <w:t>.</w:t>
+        <w:t>, Ph.D.</w:t>
       </w:r>
     </w:p>
     <w:p>
@@ -445,25 +427,7 @@
           <w:sz w:val="24"/>
           <w:szCs w:val="24"/>
         </w:rPr>
-        <w:t xml:space="preserve">, </w:t>
-      </w:r>
-      <w:proofErr w:type="spellStart"/>
-      <w:r>
-        <w:rPr>
-          <w:color w:val="000000"/>
-          <w:sz w:val="24"/>
-          <w:szCs w:val="24"/>
-        </w:rPr>
-        <w:t>Ph.D</w:t>
-      </w:r>
-      <w:proofErr w:type="spellEnd"/>
-      <w:r>
-        <w:rPr>
-          <w:color w:val="000000"/>
-          <w:sz w:val="24"/>
-          <w:szCs w:val="24"/>
-        </w:rPr>
-        <w:t>.</w:t>
+        <w:t>, Ph.D.</w:t>
       </w:r>
       <w:r>
         <w:rPr>
@@ -1290,7 +1254,6 @@
         </w:rPr>
         <w:t xml:space="preserve">l </w:t>
       </w:r>
-      <w:proofErr w:type="spellStart"/>
       <w:r>
         <w:rPr>
           <w:color w:val="000000"/>
@@ -1307,7 +1270,6 @@
         </w:rPr>
         <w:t>je</w:t>
       </w:r>
-      <w:proofErr w:type="spellEnd"/>
       <w:r>
         <w:rPr>
           <w:color w:val="000000"/>
@@ -1340,7 +1302,6 @@
         </w:rPr>
         <w:t xml:space="preserve"> </w:t>
       </w:r>
-      <w:proofErr w:type="spellStart"/>
       <w:r>
         <w:rPr>
           <w:color w:val="000000"/>
@@ -1357,7 +1318,6 @@
         </w:rPr>
         <w:t>comostada</w:t>
       </w:r>
-      <w:proofErr w:type="spellEnd"/>
       <w:r>
         <w:rPr>
           <w:color w:val="000000"/>
@@ -1396,18 +1356,8 @@
           <w:sz w:val="24"/>
           <w:szCs w:val="24"/>
         </w:rPr>
-        <w:t xml:space="preserve">n en </w:t>
-      </w:r>
-      <w:proofErr w:type="spellStart"/>
-      <w:r>
-        <w:rPr>
-          <w:color w:val="000000"/>
-          <w:sz w:val="24"/>
-          <w:szCs w:val="24"/>
-        </w:rPr>
-        <w:t>lombricompost</w:t>
-      </w:r>
-      <w:proofErr w:type="spellEnd"/>
+        <w:t>n en lombricompost</w:t>
+      </w:r>
       <w:r>
         <w:rPr>
           <w:color w:val="000000"/>
@@ -1530,23 +1480,21 @@
         </w:rPr>
         <w:t xml:space="preserve">. Por su lado, el </w:t>
       </w:r>
-      <w:proofErr w:type="spellStart"/>
       <w:r>
         <w:rPr>
           <w:color w:val="000000"/>
           <w:sz w:val="24"/>
           <w:szCs w:val="24"/>
         </w:rPr>
-        <w:t>lombricompostaje</w:t>
-      </w:r>
-      <w:proofErr w:type="spellEnd"/>
+        <w:t xml:space="preserve">lombricompostaje, así como otros procesos de compostaje, generan </w:t>
+      </w:r>
       <w:r>
         <w:rPr>
           <w:color w:val="000000"/>
           <w:sz w:val="24"/>
           <w:szCs w:val="24"/>
         </w:rPr>
-        <w:t xml:space="preserve">, así como otros procesos de compostaje, generan </w:t>
+        <w:t>óxido nitroso, amoniaco y metano</w:t>
       </w:r>
       <w:r>
         <w:rPr>
@@ -1554,7 +1502,7 @@
           <w:sz w:val="24"/>
           <w:szCs w:val="24"/>
         </w:rPr>
-        <w:t>óxido nitroso, amoniaco y metano</w:t>
+        <w:t xml:space="preserve"> (</w:t>
       </w:r>
       <w:r>
         <w:rPr>
@@ -1562,7 +1510,7 @@
           <w:sz w:val="24"/>
           <w:szCs w:val="24"/>
         </w:rPr>
-        <w:t xml:space="preserve"> (</w:t>
+        <w:t>IMN, 2021</w:t>
       </w:r>
       <w:r>
         <w:rPr>
@@ -1570,7 +1518,7 @@
           <w:sz w:val="24"/>
           <w:szCs w:val="24"/>
         </w:rPr>
-        <w:t>IMN, 2021</w:t>
+        <w:t xml:space="preserve">; </w:t>
       </w:r>
       <w:r>
         <w:rPr>
@@ -1578,7 +1526,7 @@
           <w:sz w:val="24"/>
           <w:szCs w:val="24"/>
         </w:rPr>
-        <w:t xml:space="preserve">; </w:t>
+        <w:t>Komakech et al., 201</w:t>
       </w:r>
       <w:r>
         <w:rPr>
@@ -1586,7 +1534,7 @@
           <w:sz w:val="24"/>
           <w:szCs w:val="24"/>
         </w:rPr>
-        <w:t>Komakech et al., 201</w:t>
+        <w:t>6</w:t>
       </w:r>
       <w:r>
         <w:rPr>
@@ -1594,7 +1542,7 @@
           <w:sz w:val="24"/>
           <w:szCs w:val="24"/>
         </w:rPr>
-        <w:t>6</w:t>
+        <w:t>)</w:t>
       </w:r>
       <w:r>
         <w:rPr>
@@ -1602,7 +1550,7 @@
           <w:sz w:val="24"/>
           <w:szCs w:val="24"/>
         </w:rPr>
-        <w:t>)</w:t>
+        <w:t>.</w:t>
       </w:r>
       <w:r>
         <w:rPr>
@@ -1610,7 +1558,7 @@
           <w:sz w:val="24"/>
           <w:szCs w:val="24"/>
         </w:rPr>
-        <w:t>.</w:t>
+        <w:t xml:space="preserve"> Por lo </w:t>
       </w:r>
       <w:r>
         <w:rPr>
@@ -1618,7 +1566,7 @@
           <w:sz w:val="24"/>
           <w:szCs w:val="24"/>
         </w:rPr>
-        <w:t xml:space="preserve"> Por lo </w:t>
+        <w:t>tanto,</w:t>
       </w:r>
       <w:r>
         <w:rPr>
@@ -1626,7 +1574,7 @@
           <w:sz w:val="24"/>
           <w:szCs w:val="24"/>
         </w:rPr>
-        <w:t>tanto,</w:t>
+        <w:t xml:space="preserve"> estas prácticas</w:t>
       </w:r>
       <w:r>
         <w:rPr>
@@ -1634,7 +1582,7 @@
           <w:sz w:val="24"/>
           <w:szCs w:val="24"/>
         </w:rPr>
-        <w:t xml:space="preserve"> estas prácticas</w:t>
+        <w:t xml:space="preserve"> contribuye</w:t>
       </w:r>
       <w:r>
         <w:rPr>
@@ -1642,7 +1590,7 @@
           <w:sz w:val="24"/>
           <w:szCs w:val="24"/>
         </w:rPr>
-        <w:t xml:space="preserve"> contribuye</w:t>
+        <w:t>n</w:t>
       </w:r>
       <w:r>
         <w:rPr>
@@ -1650,7 +1598,7 @@
           <w:sz w:val="24"/>
           <w:szCs w:val="24"/>
         </w:rPr>
-        <w:t>n</w:t>
+        <w:t xml:space="preserve"> a las emisiones globales de gases de efecto invernadero</w:t>
       </w:r>
       <w:r>
         <w:rPr>
@@ -1658,7 +1606,7 @@
           <w:sz w:val="24"/>
           <w:szCs w:val="24"/>
         </w:rPr>
-        <w:t xml:space="preserve"> a las emisiones globales de gases de efecto invernadero</w:t>
+        <w:t xml:space="preserve"> (GEI)</w:t>
       </w:r>
       <w:r>
         <w:rPr>
@@ -1666,7 +1614,7 @@
           <w:sz w:val="24"/>
           <w:szCs w:val="24"/>
         </w:rPr>
-        <w:t xml:space="preserve"> (GEI)</w:t>
+        <w:t xml:space="preserve">. </w:t>
       </w:r>
       <w:r>
         <w:rPr>
@@ -1674,42 +1622,40 @@
           <w:sz w:val="24"/>
           <w:szCs w:val="24"/>
         </w:rPr>
-        <w:t xml:space="preserve">. </w:t>
+        <w:t>Según el Instituto Meteorológico Nacional (IMN, 2021) las emisiones en el 2017 para el sector agricultura fueron de 2962,8 Gg de CO</w:t>
       </w:r>
       <w:r>
         <w:rPr>
           <w:color w:val="000000"/>
           <w:sz w:val="24"/>
           <w:szCs w:val="24"/>
-        </w:rPr>
-        <w:t xml:space="preserve">Según el Instituto Meteorológico Nacional (IMN, 2021) las emisiones en el 2017 para el sector agricultura fueron de 2962,8 </w:t>
-      </w:r>
-      <w:proofErr w:type="spellStart"/>
+          <w:vertAlign w:val="subscript"/>
+        </w:rPr>
+        <w:t>2</w:t>
+      </w:r>
       <w:r>
         <w:rPr>
           <w:color w:val="000000"/>
           <w:sz w:val="24"/>
           <w:szCs w:val="24"/>
         </w:rPr>
-        <w:t>Gg</w:t>
-      </w:r>
-      <w:proofErr w:type="spellEnd"/>
+        <w:t xml:space="preserve"> eq</w:t>
+      </w:r>
       <w:r>
         <w:rPr>
           <w:color w:val="000000"/>
           <w:sz w:val="24"/>
           <w:szCs w:val="24"/>
         </w:rPr>
-        <w:t xml:space="preserve"> de CO</w:t>
+        <w:t>. De</w:t>
       </w:r>
       <w:r>
         <w:rPr>
           <w:color w:val="000000"/>
           <w:sz w:val="24"/>
           <w:szCs w:val="24"/>
-          <w:vertAlign w:val="subscript"/>
-        </w:rPr>
-        <w:t>2</w:t>
+        </w:rPr>
+        <w:t xml:space="preserve"> las cuales el 7% fueron generadas por </w:t>
       </w:r>
       <w:r>
         <w:rPr>
@@ -1717,25 +1663,39 @@
           <w:sz w:val="24"/>
           <w:szCs w:val="24"/>
         </w:rPr>
+        <w:t>la</w:t>
+      </w:r>
+      <w:r>
+        <w:rPr>
+          <w:color w:val="000000"/>
+          <w:sz w:val="24"/>
+          <w:szCs w:val="24"/>
+        </w:rPr>
+        <w:t xml:space="preserve"> categoría denominada</w:t>
+      </w:r>
+      <w:r>
+        <w:rPr>
+          <w:color w:val="000000"/>
+          <w:sz w:val="24"/>
+          <w:szCs w:val="24"/>
+        </w:rPr>
         <w:t xml:space="preserve"> </w:t>
       </w:r>
-      <w:proofErr w:type="spellStart"/>
       <w:r>
         <w:rPr>
           <w:color w:val="000000"/>
           <w:sz w:val="24"/>
           <w:szCs w:val="24"/>
         </w:rPr>
-        <w:t>eq</w:t>
-      </w:r>
-      <w:proofErr w:type="spellEnd"/>
+        <w:t>gestión del estiércol.</w:t>
+      </w:r>
       <w:r>
         <w:rPr>
           <w:color w:val="000000"/>
           <w:sz w:val="24"/>
           <w:szCs w:val="24"/>
         </w:rPr>
-        <w:t>. De</w:t>
+        <w:t xml:space="preserve"> </w:t>
       </w:r>
       <w:r>
         <w:rPr>
@@ -1743,7 +1703,7 @@
           <w:sz w:val="24"/>
           <w:szCs w:val="24"/>
         </w:rPr>
-        <w:t xml:space="preserve"> las cuales el 7% fueron generadas por </w:t>
+        <w:t>Mientras que l</w:t>
       </w:r>
       <w:r>
         <w:rPr>
@@ -1751,7 +1711,7 @@
           <w:sz w:val="24"/>
           <w:szCs w:val="24"/>
         </w:rPr>
-        <w:t>la</w:t>
+        <w:t>a</w:t>
       </w:r>
       <w:r>
         <w:rPr>
@@ -1759,7 +1719,7 @@
           <w:sz w:val="24"/>
           <w:szCs w:val="24"/>
         </w:rPr>
-        <w:t xml:space="preserve"> categoría denominada</w:t>
+        <w:t xml:space="preserve"> </w:t>
       </w:r>
       <w:r>
         <w:rPr>
@@ -1767,6 +1727,54 @@
           <w:sz w:val="24"/>
           <w:szCs w:val="24"/>
         </w:rPr>
+        <w:t xml:space="preserve">emisión </w:t>
+      </w:r>
+      <w:r>
+        <w:rPr>
+          <w:color w:val="000000"/>
+          <w:sz w:val="24"/>
+          <w:szCs w:val="24"/>
+        </w:rPr>
+        <w:t xml:space="preserve">de </w:t>
+      </w:r>
+      <w:r>
+        <w:rPr>
+          <w:color w:val="000000"/>
+          <w:sz w:val="24"/>
+          <w:szCs w:val="24"/>
+        </w:rPr>
+        <w:t>m</w:t>
+      </w:r>
+      <w:r>
+        <w:rPr>
+          <w:color w:val="000000"/>
+          <w:sz w:val="24"/>
+          <w:szCs w:val="24"/>
+        </w:rPr>
+        <w:t>etano</w:t>
+      </w:r>
+      <w:r>
+        <w:rPr>
+          <w:color w:val="000000"/>
+          <w:sz w:val="24"/>
+          <w:szCs w:val="24"/>
+        </w:rPr>
+        <w:t xml:space="preserve"> para esta misma </w:t>
+      </w:r>
+      <w:r>
+        <w:rPr>
+          <w:color w:val="000000"/>
+          <w:sz w:val="24"/>
+          <w:szCs w:val="24"/>
+        </w:rPr>
+        <w:t>categoría,</w:t>
+      </w:r>
+      <w:r>
+        <w:rPr>
+          <w:color w:val="000000"/>
+          <w:sz w:val="24"/>
+          <w:szCs w:val="24"/>
+        </w:rPr>
         <w:t xml:space="preserve"> </w:t>
       </w:r>
       <w:r>
@@ -1775,7 +1783,7 @@
           <w:sz w:val="24"/>
           <w:szCs w:val="24"/>
         </w:rPr>
-        <w:t>gestión del estiércol.</w:t>
+        <w:t>en</w:t>
       </w:r>
       <w:r>
         <w:rPr>
@@ -1783,7 +1791,7 @@
           <w:sz w:val="24"/>
           <w:szCs w:val="24"/>
         </w:rPr>
-        <w:t xml:space="preserve"> </w:t>
+        <w:t xml:space="preserve"> ese mismo año</w:t>
       </w:r>
       <w:r>
         <w:rPr>
@@ -1791,7 +1799,7 @@
           <w:sz w:val="24"/>
           <w:szCs w:val="24"/>
         </w:rPr>
-        <w:t>Mientras que l</w:t>
+        <w:t>,</w:t>
       </w:r>
       <w:r>
         <w:rPr>
@@ -1799,121 +1807,7 @@
           <w:sz w:val="24"/>
           <w:szCs w:val="24"/>
         </w:rPr>
-        <w:t>a</w:t>
-      </w:r>
-      <w:r>
-        <w:rPr>
-          <w:color w:val="000000"/>
-          <w:sz w:val="24"/>
-          <w:szCs w:val="24"/>
-        </w:rPr>
-        <w:t xml:space="preserve"> </w:t>
-      </w:r>
-      <w:r>
-        <w:rPr>
-          <w:color w:val="000000"/>
-          <w:sz w:val="24"/>
-          <w:szCs w:val="24"/>
-        </w:rPr>
-        <w:t xml:space="preserve">emisión </w:t>
-      </w:r>
-      <w:r>
-        <w:rPr>
-          <w:color w:val="000000"/>
-          <w:sz w:val="24"/>
-          <w:szCs w:val="24"/>
-        </w:rPr>
-        <w:t xml:space="preserve">de </w:t>
-      </w:r>
-      <w:r>
-        <w:rPr>
-          <w:color w:val="000000"/>
-          <w:sz w:val="24"/>
-          <w:szCs w:val="24"/>
-        </w:rPr>
-        <w:t>m</w:t>
-      </w:r>
-      <w:r>
-        <w:rPr>
-          <w:color w:val="000000"/>
-          <w:sz w:val="24"/>
-          <w:szCs w:val="24"/>
-        </w:rPr>
-        <w:t>etano</w:t>
-      </w:r>
-      <w:r>
-        <w:rPr>
-          <w:color w:val="000000"/>
-          <w:sz w:val="24"/>
-          <w:szCs w:val="24"/>
-        </w:rPr>
-        <w:t xml:space="preserve"> para esta misma </w:t>
-      </w:r>
-      <w:r>
-        <w:rPr>
-          <w:color w:val="000000"/>
-          <w:sz w:val="24"/>
-          <w:szCs w:val="24"/>
-        </w:rPr>
-        <w:t>categoría,</w:t>
-      </w:r>
-      <w:r>
-        <w:rPr>
-          <w:color w:val="000000"/>
-          <w:sz w:val="24"/>
-          <w:szCs w:val="24"/>
-        </w:rPr>
-        <w:t xml:space="preserve"> </w:t>
-      </w:r>
-      <w:r>
-        <w:rPr>
-          <w:color w:val="000000"/>
-          <w:sz w:val="24"/>
-          <w:szCs w:val="24"/>
-        </w:rPr>
-        <w:t>en</w:t>
-      </w:r>
-      <w:r>
-        <w:rPr>
-          <w:color w:val="000000"/>
-          <w:sz w:val="24"/>
-          <w:szCs w:val="24"/>
-        </w:rPr>
-        <w:t xml:space="preserve"> ese mismo año</w:t>
-      </w:r>
-      <w:r>
-        <w:rPr>
-          <w:color w:val="000000"/>
-          <w:sz w:val="24"/>
-          <w:szCs w:val="24"/>
-        </w:rPr>
-        <w:t>,</w:t>
-      </w:r>
-      <w:r>
-        <w:rPr>
-          <w:color w:val="000000"/>
-          <w:sz w:val="24"/>
-          <w:szCs w:val="24"/>
-        </w:rPr>
-        <w:t xml:space="preserve"> fue de 1,841 </w:t>
-      </w:r>
-      <w:proofErr w:type="spellStart"/>
-      <w:r>
-        <w:rPr>
-          <w:color w:val="000000"/>
-          <w:sz w:val="24"/>
-          <w:szCs w:val="24"/>
-        </w:rPr>
-        <w:t>Gg</w:t>
-      </w:r>
-      <w:proofErr w:type="spellEnd"/>
-      <w:r>
-        <w:rPr>
-          <w:color w:val="000000"/>
-          <w:sz w:val="24"/>
-          <w:szCs w:val="24"/>
-        </w:rPr>
-        <w:t xml:space="preserve"> de CH</w:t>
+        <w:t xml:space="preserve"> fue de 1,841 Gg de CH</w:t>
       </w:r>
       <w:r>
         <w:rPr>
@@ -2586,21 +2480,12 @@
         </w:rPr>
         <w:t>(</w:t>
       </w:r>
-      <w:proofErr w:type="spellStart"/>
-      <w:r>
-        <w:rPr>
-          <w:sz w:val="24"/>
-          <w:szCs w:val="24"/>
-        </w:rPr>
-        <w:t>Fernandez</w:t>
-      </w:r>
-      <w:proofErr w:type="spellEnd"/>
-      <w:r>
-        <w:rPr>
-          <w:sz w:val="24"/>
-          <w:szCs w:val="24"/>
-        </w:rPr>
-        <w:t>, 2014)</w:t>
+      <w:r>
+        <w:rPr>
+          <w:sz w:val="24"/>
+          <w:szCs w:val="24"/>
+        </w:rPr>
+        <w:t>Fernandez, 2014)</w:t>
       </w:r>
       <w:r>
         <w:rPr>
@@ -2864,15 +2749,7 @@
           <w:sz w:val="24"/>
           <w:szCs w:val="24"/>
         </w:rPr>
-        <w:t xml:space="preserve">a </w:t>
-      </w:r>
-      <w:proofErr w:type="spellStart"/>
-      <w:r>
-        <w:rPr>
-          <w:sz w:val="24"/>
-          <w:szCs w:val="24"/>
-        </w:rPr>
-        <w:t>lombricomposta</w:t>
+        <w:t>a lombricomposta</w:t>
       </w:r>
       <w:r>
         <w:rPr>
@@ -2881,7 +2758,6 @@
         </w:rPr>
         <w:t>je</w:t>
       </w:r>
-      <w:proofErr w:type="spellEnd"/>
       <w:r>
         <w:rPr>
           <w:sz w:val="24"/>
@@ -3145,7 +3021,6 @@
         </w:rPr>
         <w:t xml:space="preserve"> </w:t>
       </w:r>
-      <w:proofErr w:type="spellStart"/>
       <w:r>
         <w:rPr>
           <w:sz w:val="24"/>
@@ -3153,7 +3028,6 @@
         </w:rPr>
         <w:t>lombricompostaje</w:t>
       </w:r>
-      <w:proofErr w:type="spellEnd"/>
       <w:r>
         <w:rPr>
           <w:sz w:val="24"/>
@@ -3541,23 +3415,7 @@
           <w:sz w:val="24"/>
           <w:szCs w:val="24"/>
         </w:rPr>
-        <w:t xml:space="preserve">, en el cual se analizará el procesamiento del estiércol mediante </w:t>
-      </w:r>
-      <w:proofErr w:type="spellStart"/>
-      <w:r>
-        <w:rPr>
-          <w:sz w:val="24"/>
-          <w:szCs w:val="24"/>
-        </w:rPr>
-        <w:t>lombricompostaje</w:t>
-      </w:r>
-      <w:proofErr w:type="spellEnd"/>
-      <w:r>
-        <w:rPr>
-          <w:sz w:val="24"/>
-          <w:szCs w:val="24"/>
-        </w:rPr>
-        <w:t xml:space="preserve"> y la aplicación de aguas verdes en los campos de pastoreo. Seguidamente, se realizará el inventario para el escenario alternativo, en el cual se aplican los purines directamente</w:t>
+        <w:t>, en el cual se analizará el procesamiento del estiércol mediante lombricompostaje y la aplicación de aguas verdes en los campos de pastoreo. Seguidamente, se realizará el inventario para el escenario alternativo, en el cual se aplican los purines directamente</w:t>
       </w:r>
       <w:r>
         <w:rPr>
@@ -5009,7 +4867,6 @@
         <w:t xml:space="preserve">2.1 </w:t>
       </w:r>
       <w:bookmarkStart w:id="1" w:name="_Hlk186102913"/>
-      <w:proofErr w:type="spellStart"/>
       <w:r>
         <w:rPr>
           <w:i/>
@@ -5029,7 +4886,6 @@
         </w:rPr>
         <w:t>compostaje</w:t>
       </w:r>
-      <w:proofErr w:type="spellEnd"/>
     </w:p>
     <w:p>
       <w:pPr>
@@ -5054,7 +4910,6 @@
         </w:rPr>
         <w:t xml:space="preserve">El </w:t>
       </w:r>
-      <w:proofErr w:type="spellStart"/>
       <w:r>
         <w:rPr>
           <w:sz w:val="24"/>
@@ -5076,7 +4931,6 @@
         </w:rPr>
         <w:t>compostaje</w:t>
       </w:r>
-      <w:proofErr w:type="spellEnd"/>
       <w:r>
         <w:rPr>
           <w:sz w:val="24"/>
@@ -5090,25 +4944,8 @@
           <w:szCs w:val="24"/>
         </w:rPr>
         <w:lastRenderedPageBreak/>
-        <w:t xml:space="preserve">el manejo del estiércol bovino. Esta técnica también es considerada un proceso </w:t>
-      </w:r>
-      <w:proofErr w:type="spellStart"/>
-      <w:r>
-        <w:rPr>
-          <w:sz w:val="24"/>
-          <w:szCs w:val="24"/>
-        </w:rPr>
-        <w:t>bioecológicamente</w:t>
-      </w:r>
-      <w:proofErr w:type="spellEnd"/>
-      <w:r>
-        <w:rPr>
-          <w:sz w:val="24"/>
-          <w:szCs w:val="24"/>
-        </w:rPr>
-        <w:t xml:space="preserve"> sostenible, ya que produce recursos biológicos renovables con valor agregado. En este sentido, se generan tanto </w:t>
-      </w:r>
-      <w:proofErr w:type="spellStart"/>
+        <w:t xml:space="preserve">el manejo del estiércol bovino. Esta técnica también es considerada un proceso bioecológicamente sostenible, ya que produce recursos biológicos renovables con valor agregado. En este sentido, se generan tanto </w:t>
+      </w:r>
       <w:r>
         <w:rPr>
           <w:sz w:val="24"/>
@@ -5130,7 +4967,6 @@
         </w:rPr>
         <w:t>ompost</w:t>
       </w:r>
-      <w:proofErr w:type="spellEnd"/>
       <w:r>
         <w:rPr>
           <w:sz w:val="24"/>
@@ -6109,15 +5945,41 @@
         </w:rPr>
         <w:t>(</w:t>
       </w:r>
-      <w:proofErr w:type="spellStart"/>
-      <w:r>
-        <w:rPr>
-          <w:sz w:val="24"/>
-          <w:szCs w:val="24"/>
-        </w:rPr>
-        <w:t>Technical</w:t>
-      </w:r>
-      <w:proofErr w:type="spellEnd"/>
+      <w:r>
+        <w:rPr>
+          <w:sz w:val="24"/>
+          <w:szCs w:val="24"/>
+        </w:rPr>
+        <w:t>Technical Committee ISO/TC 207</w:t>
+      </w:r>
+      <w:r>
+        <w:rPr>
+          <w:sz w:val="24"/>
+          <w:szCs w:val="24"/>
+        </w:rPr>
+        <w:t xml:space="preserve">, </w:t>
+      </w:r>
+      <w:r>
+        <w:rPr>
+          <w:sz w:val="24"/>
+          <w:szCs w:val="24"/>
+        </w:rPr>
+        <w:t>2006)</w:t>
+      </w:r>
+      <w:r>
+        <w:rPr>
+          <w:sz w:val="24"/>
+          <w:szCs w:val="24"/>
+        </w:rPr>
+        <w:t>, comprende cuatro fases interrelacionadas</w:t>
+      </w:r>
+      <w:r>
+        <w:rPr>
+          <w:sz w:val="24"/>
+          <w:szCs w:val="24"/>
+        </w:rPr>
+        <w:t>.</w:t>
+      </w:r>
       <w:r>
         <w:rPr>
           <w:sz w:val="24"/>
@@ -6125,49 +5987,61 @@
         </w:rPr>
         <w:t xml:space="preserve"> </w:t>
       </w:r>
-      <w:proofErr w:type="spellStart"/>
-      <w:r>
-        <w:rPr>
-          <w:sz w:val="24"/>
-          <w:szCs w:val="24"/>
-        </w:rPr>
-        <w:t>Committee</w:t>
-      </w:r>
-      <w:proofErr w:type="spellEnd"/>
-      <w:r>
-        <w:rPr>
-          <w:sz w:val="24"/>
-          <w:szCs w:val="24"/>
-        </w:rPr>
-        <w:t xml:space="preserve"> ISO/TC 207</w:t>
-      </w:r>
-      <w:r>
-        <w:rPr>
-          <w:sz w:val="24"/>
-          <w:szCs w:val="24"/>
-        </w:rPr>
-        <w:t xml:space="preserve">, </w:t>
-      </w:r>
-      <w:r>
-        <w:rPr>
-          <w:sz w:val="24"/>
-          <w:szCs w:val="24"/>
-        </w:rPr>
-        <w:t>2006)</w:t>
-      </w:r>
-      <w:r>
-        <w:rPr>
-          <w:sz w:val="24"/>
-          <w:szCs w:val="24"/>
-        </w:rPr>
-        <w:t>, comprende cuatro fases interrelacionadas</w:t>
-      </w:r>
-      <w:r>
-        <w:rPr>
-          <w:sz w:val="24"/>
-          <w:szCs w:val="24"/>
-        </w:rPr>
-        <w:t>.</w:t>
+      <w:r>
+        <w:rPr>
+          <w:sz w:val="24"/>
+          <w:szCs w:val="24"/>
+        </w:rPr>
+        <w:t xml:space="preserve">La </w:t>
+      </w:r>
+      <w:r>
+        <w:rPr>
+          <w:sz w:val="24"/>
+          <w:szCs w:val="24"/>
+        </w:rPr>
+        <w:t xml:space="preserve">primera fase </w:t>
+      </w:r>
+      <w:r>
+        <w:rPr>
+          <w:sz w:val="24"/>
+          <w:szCs w:val="24"/>
+        </w:rPr>
+        <w:t>es</w:t>
+      </w:r>
+      <w:r>
+        <w:rPr>
+          <w:sz w:val="24"/>
+          <w:szCs w:val="24"/>
+        </w:rPr>
+        <w:t xml:space="preserve"> la </w:t>
+      </w:r>
+      <w:r>
+        <w:rPr>
+          <w:sz w:val="24"/>
+          <w:szCs w:val="24"/>
+        </w:rPr>
+        <w:t>d</w:t>
+      </w:r>
+      <w:r>
+        <w:rPr>
+          <w:sz w:val="24"/>
+          <w:szCs w:val="24"/>
+        </w:rPr>
+        <w:t xml:space="preserve">efinición clara del objetivo y alcance del estudio, que incluye la selección de una unidad funcional: una descripción cuantificada del desempeño del sistema del producto. En esta fase se identifican los </w:t>
+      </w:r>
+      <w:r>
+        <w:rPr>
+          <w:sz w:val="24"/>
+          <w:szCs w:val="24"/>
+        </w:rPr>
+        <w:t>escenarios</w:t>
+      </w:r>
+      <w:r>
+        <w:rPr>
+          <w:sz w:val="24"/>
+          <w:szCs w:val="24"/>
+        </w:rPr>
+        <w:t xml:space="preserve"> comparar y las categorías de impacto ambiental que se evaluarán</w:t>
       </w:r>
       <w:r>
         <w:rPr>
@@ -6181,86 +6055,7 @@
           <w:sz w:val="24"/>
           <w:szCs w:val="24"/>
         </w:rPr>
-        <w:t xml:space="preserve">La </w:t>
-      </w:r>
-      <w:r>
-        <w:rPr>
-          <w:sz w:val="24"/>
-          <w:szCs w:val="24"/>
-        </w:rPr>
-        <w:t xml:space="preserve">primera fase </w:t>
-      </w:r>
-      <w:r>
-        <w:rPr>
-          <w:sz w:val="24"/>
-          <w:szCs w:val="24"/>
-        </w:rPr>
-        <w:t>es</w:t>
-      </w:r>
-      <w:r>
-        <w:rPr>
-          <w:sz w:val="24"/>
-          <w:szCs w:val="24"/>
-        </w:rPr>
-        <w:t xml:space="preserve"> la </w:t>
-      </w:r>
-      <w:r>
-        <w:rPr>
-          <w:sz w:val="24"/>
-          <w:szCs w:val="24"/>
-        </w:rPr>
-        <w:t>d</w:t>
-      </w:r>
-      <w:r>
-        <w:rPr>
-          <w:sz w:val="24"/>
-          <w:szCs w:val="24"/>
-        </w:rPr>
-        <w:t xml:space="preserve">efinición clara del objetivo y alcance del estudio, que incluye la selección de una unidad funcional: una descripción cuantificada del desempeño del sistema del producto. En esta fase se identifican los </w:t>
-      </w:r>
-      <w:r>
-        <w:rPr>
-          <w:sz w:val="24"/>
-          <w:szCs w:val="24"/>
-        </w:rPr>
-        <w:t>escenarios</w:t>
-      </w:r>
-      <w:r>
-        <w:rPr>
-          <w:sz w:val="24"/>
-          <w:szCs w:val="24"/>
-        </w:rPr>
-        <w:t xml:space="preserve"> comparar y las categorías de impacto ambiental que se evaluarán</w:t>
-      </w:r>
-      <w:r>
-        <w:rPr>
-          <w:sz w:val="24"/>
-          <w:szCs w:val="24"/>
-        </w:rPr>
-        <w:t xml:space="preserve"> </w:t>
-      </w:r>
-      <w:r>
-        <w:rPr>
-          <w:sz w:val="24"/>
-          <w:szCs w:val="24"/>
-        </w:rPr>
-        <w:t>(</w:t>
-      </w:r>
-      <w:proofErr w:type="spellStart"/>
-      <w:r>
-        <w:rPr>
-          <w:sz w:val="24"/>
-          <w:szCs w:val="24"/>
-        </w:rPr>
-        <w:t>Macktoobian</w:t>
-      </w:r>
-      <w:proofErr w:type="spellEnd"/>
-      <w:r>
-        <w:rPr>
-          <w:sz w:val="24"/>
-          <w:szCs w:val="24"/>
-        </w:rPr>
-        <w:t>, 2024)</w:t>
+        <w:t>(Macktoobian, 2024)</w:t>
       </w:r>
       <w:r>
         <w:rPr>
@@ -6484,23 +6279,7 @@
           <w:sz w:val="24"/>
           <w:szCs w:val="24"/>
         </w:rPr>
-        <w:t>(</w:t>
-      </w:r>
-      <w:proofErr w:type="spellStart"/>
-      <w:r>
-        <w:rPr>
-          <w:sz w:val="24"/>
-          <w:szCs w:val="24"/>
-        </w:rPr>
-        <w:t>Macktoobian</w:t>
-      </w:r>
-      <w:proofErr w:type="spellEnd"/>
-      <w:r>
-        <w:rPr>
-          <w:sz w:val="24"/>
-          <w:szCs w:val="24"/>
-        </w:rPr>
-        <w:t>, 2024)</w:t>
+        <w:t>(Macktoobian, 2024)</w:t>
       </w:r>
     </w:p>
     <w:p>
@@ -6526,7 +6305,6 @@
         </w:rPr>
         <w:t xml:space="preserve">Siguiendo con </w:t>
       </w:r>
-      <w:proofErr w:type="spellStart"/>
       <w:r>
         <w:rPr>
           <w:sz w:val="24"/>
@@ -6534,7 +6312,6 @@
         </w:rPr>
         <w:t>Macktoobian</w:t>
       </w:r>
-      <w:proofErr w:type="spellEnd"/>
       <w:r>
         <w:rPr>
           <w:sz w:val="24"/>
@@ -6754,23 +6531,7 @@
           <w:sz w:val="24"/>
           <w:szCs w:val="24"/>
         </w:rPr>
-        <w:t>(</w:t>
-      </w:r>
-      <w:proofErr w:type="spellStart"/>
-      <w:r>
-        <w:rPr>
-          <w:sz w:val="24"/>
-          <w:szCs w:val="24"/>
-        </w:rPr>
-        <w:t>Macktoobian</w:t>
-      </w:r>
-      <w:proofErr w:type="spellEnd"/>
-      <w:r>
-        <w:rPr>
-          <w:sz w:val="24"/>
-          <w:szCs w:val="24"/>
-        </w:rPr>
-        <w:t>, 2024</w:t>
+        <w:t>(Macktoobian, 2024</w:t>
       </w:r>
       <w:r>
         <w:rPr>
@@ -6815,23 +6576,7 @@
           <w:sz w:val="24"/>
           <w:szCs w:val="24"/>
         </w:rPr>
-        <w:t>(</w:t>
-      </w:r>
-      <w:proofErr w:type="spellStart"/>
-      <w:r>
-        <w:rPr>
-          <w:sz w:val="24"/>
-          <w:szCs w:val="24"/>
-        </w:rPr>
-        <w:t>Macktoobian</w:t>
-      </w:r>
-      <w:proofErr w:type="spellEnd"/>
-      <w:r>
-        <w:rPr>
-          <w:sz w:val="24"/>
-          <w:szCs w:val="24"/>
-        </w:rPr>
-        <w:t>, 2024</w:t>
+        <w:t>(Macktoobian, 2024</w:t>
       </w:r>
       <w:r>
         <w:rPr>
@@ -7649,23 +7394,7 @@
           <w:sz w:val="24"/>
           <w:szCs w:val="24"/>
         </w:rPr>
-        <w:t xml:space="preserve"> 1998; </w:t>
-      </w:r>
-      <w:proofErr w:type="spellStart"/>
-      <w:r>
-        <w:rPr>
-          <w:sz w:val="24"/>
-          <w:szCs w:val="24"/>
-        </w:rPr>
-        <w:t>Monteny</w:t>
-      </w:r>
-      <w:proofErr w:type="spellEnd"/>
-      <w:r>
-        <w:rPr>
-          <w:sz w:val="24"/>
-          <w:szCs w:val="24"/>
-        </w:rPr>
-        <w:t xml:space="preserve"> y Erisman 1998). Las pérdidas de nitrógeno comienzan en el punto de excreción </w:t>
+        <w:t xml:space="preserve"> 1998; Monteny y Erisman 1998). Las pérdidas de nitrógeno comienzan en el punto de excreción </w:t>
       </w:r>
       <w:r>
         <w:rPr>
@@ -7885,7 +7614,6 @@
         </w:rPr>
         <w:t xml:space="preserve">En general, la reutilización de residuos sólidos mediante procesos de compostaje y </w:t>
       </w:r>
-      <w:proofErr w:type="spellStart"/>
       <w:r>
         <w:rPr>
           <w:sz w:val="24"/>
@@ -7898,15 +7626,7 @@
           <w:sz w:val="24"/>
           <w:szCs w:val="24"/>
         </w:rPr>
-        <w:t>compostaje</w:t>
-      </w:r>
-      <w:proofErr w:type="spellEnd"/>
-      <w:r>
-        <w:rPr>
-          <w:sz w:val="24"/>
-          <w:szCs w:val="24"/>
-        </w:rPr>
-        <w:t xml:space="preserve"> genera un impacto positivo en el medio ambiente (Lim et al., 2016)</w:t>
+        <w:t>compostaje genera un impacto positivo en el medio ambiente (Lim et al., 2016)</w:t>
       </w:r>
       <w:r>
         <w:rPr>
@@ -8110,30 +7830,86 @@
           <w:sz w:val="24"/>
           <w:szCs w:val="24"/>
         </w:rPr>
+        <w:t xml:space="preserve"> eq/ton </w:t>
+      </w:r>
+      <w:r>
+        <w:rPr>
+          <w:sz w:val="24"/>
+          <w:szCs w:val="24"/>
+        </w:rPr>
+        <w:t>y 126</w:t>
+      </w:r>
+      <w:r>
+        <w:rPr>
+          <w:sz w:val="24"/>
+          <w:szCs w:val="24"/>
+        </w:rPr>
+        <w:t>,</w:t>
+      </w:r>
+      <w:r>
+        <w:rPr>
+          <w:sz w:val="24"/>
+          <w:szCs w:val="24"/>
+        </w:rPr>
+        <w:t>4 gPO</w:t>
+      </w:r>
+      <w:r>
+        <w:rPr>
+          <w:sz w:val="24"/>
+          <w:szCs w:val="24"/>
+          <w:vertAlign w:val="subscript"/>
+        </w:rPr>
+        <w:t>4</w:t>
+      </w:r>
+      <w:r>
+        <w:rPr>
+          <w:sz w:val="24"/>
+          <w:szCs w:val="24"/>
+          <w:vertAlign w:val="superscript"/>
+        </w:rPr>
+        <w:t>-3</w:t>
+      </w:r>
+      <w:r>
+        <w:rPr>
+          <w:sz w:val="24"/>
+          <w:szCs w:val="24"/>
+        </w:rPr>
         <w:t xml:space="preserve"> </w:t>
       </w:r>
-      <w:proofErr w:type="spellStart"/>
-      <w:r>
-        <w:rPr>
-          <w:sz w:val="24"/>
-          <w:szCs w:val="24"/>
-        </w:rPr>
-        <w:t>eq</w:t>
-      </w:r>
-      <w:proofErr w:type="spellEnd"/>
-      <w:r>
-        <w:rPr>
-          <w:sz w:val="24"/>
-          <w:szCs w:val="24"/>
-        </w:rPr>
-        <w:t xml:space="preserve">/ton </w:t>
-      </w:r>
-      <w:r>
-        <w:rPr>
-          <w:sz w:val="24"/>
-          <w:szCs w:val="24"/>
-        </w:rPr>
-        <w:t>y 126</w:t>
+      <w:r>
+        <w:rPr>
+          <w:sz w:val="24"/>
+          <w:szCs w:val="24"/>
+        </w:rPr>
+        <w:t>eq/ton</w:t>
+      </w:r>
+      <w:r>
+        <w:rPr>
+          <w:sz w:val="24"/>
+          <w:szCs w:val="24"/>
+        </w:rPr>
+        <w:t xml:space="preserve"> que</w:t>
+      </w:r>
+      <w:r>
+        <w:rPr>
+          <w:sz w:val="24"/>
+          <w:szCs w:val="24"/>
+        </w:rPr>
+        <w:t xml:space="preserve"> el </w:t>
+      </w:r>
+      <w:r>
+        <w:rPr>
+          <w:sz w:val="24"/>
+          <w:szCs w:val="24"/>
+        </w:rPr>
+        <w:t>lombr</w:t>
+      </w:r>
+      <w:r>
+        <w:rPr>
+          <w:sz w:val="24"/>
+          <w:szCs w:val="24"/>
+        </w:rPr>
+        <w:t>icompostaje</w:t>
       </w:r>
       <w:r>
         <w:rPr>
@@ -8147,89 +7923,6 @@
           <w:sz w:val="24"/>
           <w:szCs w:val="24"/>
         </w:rPr>
-        <w:t>4 gPO</w:t>
-      </w:r>
-      <w:r>
-        <w:rPr>
-          <w:sz w:val="24"/>
-          <w:szCs w:val="24"/>
-          <w:vertAlign w:val="subscript"/>
-        </w:rPr>
-        <w:t>4</w:t>
-      </w:r>
-      <w:r>
-        <w:rPr>
-          <w:sz w:val="24"/>
-          <w:szCs w:val="24"/>
-          <w:vertAlign w:val="superscript"/>
-        </w:rPr>
-        <w:t>-3</w:t>
-      </w:r>
-      <w:r>
-        <w:rPr>
-          <w:sz w:val="24"/>
-          <w:szCs w:val="24"/>
-        </w:rPr>
-        <w:t xml:space="preserve"> </w:t>
-      </w:r>
-      <w:proofErr w:type="spellStart"/>
-      <w:r>
-        <w:rPr>
-          <w:sz w:val="24"/>
-          <w:szCs w:val="24"/>
-        </w:rPr>
-        <w:t>eq</w:t>
-      </w:r>
-      <w:proofErr w:type="spellEnd"/>
-      <w:r>
-        <w:rPr>
-          <w:sz w:val="24"/>
-          <w:szCs w:val="24"/>
-        </w:rPr>
-        <w:t>/ton</w:t>
-      </w:r>
-      <w:r>
-        <w:rPr>
-          <w:sz w:val="24"/>
-          <w:szCs w:val="24"/>
-        </w:rPr>
-        <w:t xml:space="preserve"> que</w:t>
-      </w:r>
-      <w:r>
-        <w:rPr>
-          <w:sz w:val="24"/>
-          <w:szCs w:val="24"/>
-        </w:rPr>
-        <w:t xml:space="preserve"> el </w:t>
-      </w:r>
-      <w:proofErr w:type="spellStart"/>
-      <w:r>
-        <w:rPr>
-          <w:sz w:val="24"/>
-          <w:szCs w:val="24"/>
-        </w:rPr>
-        <w:t>lombr</w:t>
-      </w:r>
-      <w:r>
-        <w:rPr>
-          <w:sz w:val="24"/>
-          <w:szCs w:val="24"/>
-        </w:rPr>
-        <w:t>icompostaje</w:t>
-      </w:r>
-      <w:proofErr w:type="spellEnd"/>
-      <w:r>
-        <w:rPr>
-          <w:sz w:val="24"/>
-          <w:szCs w:val="24"/>
-        </w:rPr>
-        <w:t>,</w:t>
-      </w:r>
-      <w:r>
-        <w:rPr>
-          <w:sz w:val="24"/>
-          <w:szCs w:val="24"/>
-        </w:rPr>
         <w:t xml:space="preserve"> respectivamente</w:t>
       </w:r>
       <w:r>
@@ -8281,7 +7974,6 @@
         </w:rPr>
         <w:t xml:space="preserve"> de implementar y que en términos de calentamiento global el sistema de </w:t>
       </w:r>
-      <w:proofErr w:type="spellStart"/>
       <w:r>
         <w:rPr>
           <w:sz w:val="24"/>
@@ -8289,7 +7981,6 @@
         </w:rPr>
         <w:t>lombricompostaje</w:t>
       </w:r>
-      <w:proofErr w:type="spellEnd"/>
       <w:r>
         <w:rPr>
           <w:sz w:val="24"/>
@@ -8394,7 +8085,6 @@
         </w:rPr>
         <w:tab/>
       </w:r>
-      <w:proofErr w:type="spellStart"/>
       <w:r>
         <w:rPr>
           <w:sz w:val="24"/>
@@ -8402,7 +8092,6 @@
         </w:rPr>
         <w:t>Macktoobian</w:t>
       </w:r>
-      <w:proofErr w:type="spellEnd"/>
       <w:r>
         <w:rPr>
           <w:sz w:val="24"/>
@@ -8452,7 +8141,6 @@
         </w:rPr>
         <w:t xml:space="preserve">detallado del proceso de </w:t>
       </w:r>
-      <w:proofErr w:type="spellStart"/>
       <w:r>
         <w:rPr>
           <w:sz w:val="24"/>
@@ -8467,7 +8155,6 @@
         </w:rPr>
         <w:t>compostaje</w:t>
       </w:r>
-      <w:proofErr w:type="spellEnd"/>
       <w:r>
         <w:rPr>
           <w:sz w:val="24"/>
@@ -8482,7 +8169,6 @@
         </w:rPr>
         <w:t xml:space="preserve">. Usando como unidad funcional 1 kg de </w:t>
       </w:r>
-      <w:proofErr w:type="spellStart"/>
       <w:r>
         <w:rPr>
           <w:sz w:val="24"/>
@@ -8495,39 +8181,7 @@
           <w:sz w:val="24"/>
           <w:szCs w:val="24"/>
         </w:rPr>
-        <w:t>compost</w:t>
-      </w:r>
-      <w:proofErr w:type="spellEnd"/>
-      <w:r>
-        <w:rPr>
-          <w:sz w:val="24"/>
-          <w:szCs w:val="24"/>
-        </w:rPr>
-        <w:t xml:space="preserve"> y tomando datos de la base </w:t>
-      </w:r>
-      <w:proofErr w:type="spellStart"/>
-      <w:r>
-        <w:rPr>
-          <w:sz w:val="24"/>
-          <w:szCs w:val="24"/>
-        </w:rPr>
-        <w:t>EcoInvent</w:t>
-      </w:r>
-      <w:proofErr w:type="spellEnd"/>
-      <w:r>
-        <w:rPr>
-          <w:sz w:val="24"/>
-          <w:szCs w:val="24"/>
-        </w:rPr>
-        <w:t xml:space="preserve"> y evaluaciones de impacto de </w:t>
-      </w:r>
-      <w:proofErr w:type="spellStart"/>
-      <w:r>
-        <w:rPr>
-          <w:sz w:val="24"/>
-          <w:szCs w:val="24"/>
-        </w:rPr>
-        <w:t>ReCiP</w:t>
+        <w:t>compost y tomando datos de la base EcoInvent y evaluaciones de impacto de ReCiP</w:t>
       </w:r>
       <w:r>
         <w:rPr>
@@ -8536,7 +8190,6 @@
         </w:rPr>
         <w:t>e</w:t>
       </w:r>
-      <w:proofErr w:type="spellEnd"/>
       <w:r>
         <w:rPr>
           <w:sz w:val="24"/>
@@ -8585,93 +8238,45 @@
           <w:sz w:val="24"/>
           <w:szCs w:val="24"/>
         </w:rPr>
+        <w:t xml:space="preserve"> eq para el calentamiento global, 1,18 × 10</w:t>
+      </w:r>
+      <w:r>
+        <w:rPr>
+          <w:sz w:val="24"/>
+          <w:szCs w:val="24"/>
+          <w:vertAlign w:val="superscript"/>
+        </w:rPr>
+        <w:t>-8</w:t>
+      </w:r>
+      <w:r>
+        <w:rPr>
+          <w:sz w:val="24"/>
+          <w:szCs w:val="24"/>
+        </w:rPr>
+        <w:t xml:space="preserve"> kg de P eq para la eutrofización del agua dulce y 2,17 × 10</w:t>
+      </w:r>
+      <w:r>
+        <w:rPr>
+          <w:sz w:val="24"/>
+          <w:szCs w:val="24"/>
+          <w:vertAlign w:val="superscript"/>
+        </w:rPr>
+        <w:t>-9</w:t>
+      </w:r>
+      <w:r>
+        <w:rPr>
+          <w:sz w:val="24"/>
+          <w:szCs w:val="24"/>
+        </w:rPr>
+        <w:t xml:space="preserve"> kg de N eq para la eutrofización marina.</w:t>
+      </w:r>
+      <w:r>
+        <w:rPr>
+          <w:sz w:val="24"/>
+          <w:szCs w:val="24"/>
+        </w:rPr>
         <w:t xml:space="preserve"> </w:t>
       </w:r>
-      <w:proofErr w:type="spellStart"/>
-      <w:r>
-        <w:rPr>
-          <w:sz w:val="24"/>
-          <w:szCs w:val="24"/>
-        </w:rPr>
-        <w:t>eq</w:t>
-      </w:r>
-      <w:proofErr w:type="spellEnd"/>
-      <w:r>
-        <w:rPr>
-          <w:sz w:val="24"/>
-          <w:szCs w:val="24"/>
-        </w:rPr>
-        <w:t xml:space="preserve"> para el calentamiento global, 1,18 × 10</w:t>
-      </w:r>
-      <w:r>
-        <w:rPr>
-          <w:sz w:val="24"/>
-          <w:szCs w:val="24"/>
-          <w:vertAlign w:val="superscript"/>
-        </w:rPr>
-        <w:t>-8</w:t>
-      </w:r>
-      <w:r>
-        <w:rPr>
-          <w:sz w:val="24"/>
-          <w:szCs w:val="24"/>
-        </w:rPr>
-        <w:t xml:space="preserve"> kg de P </w:t>
-      </w:r>
-      <w:proofErr w:type="spellStart"/>
-      <w:r>
-        <w:rPr>
-          <w:sz w:val="24"/>
-          <w:szCs w:val="24"/>
-        </w:rPr>
-        <w:t>eq</w:t>
-      </w:r>
-      <w:proofErr w:type="spellEnd"/>
-      <w:r>
-        <w:rPr>
-          <w:sz w:val="24"/>
-          <w:szCs w:val="24"/>
-        </w:rPr>
-        <w:t xml:space="preserve"> para la eutrofización del agua dulce y 2,17 × 10</w:t>
-      </w:r>
-      <w:r>
-        <w:rPr>
-          <w:sz w:val="24"/>
-          <w:szCs w:val="24"/>
-          <w:vertAlign w:val="superscript"/>
-        </w:rPr>
-        <w:t>-9</w:t>
-      </w:r>
-      <w:r>
-        <w:rPr>
-          <w:sz w:val="24"/>
-          <w:szCs w:val="24"/>
-        </w:rPr>
-        <w:t xml:space="preserve"> kg de N </w:t>
-      </w:r>
-      <w:proofErr w:type="spellStart"/>
-      <w:r>
-        <w:rPr>
-          <w:sz w:val="24"/>
-          <w:szCs w:val="24"/>
-        </w:rPr>
-        <w:t>eq</w:t>
-      </w:r>
-      <w:proofErr w:type="spellEnd"/>
-      <w:r>
-        <w:rPr>
-          <w:sz w:val="24"/>
-          <w:szCs w:val="24"/>
-        </w:rPr>
-        <w:t xml:space="preserve"> para la eutrofización marina.</w:t>
-      </w:r>
-      <w:r>
-        <w:rPr>
-          <w:sz w:val="24"/>
-          <w:szCs w:val="24"/>
-        </w:rPr>
-        <w:t xml:space="preserve"> </w:t>
-      </w:r>
       <w:r>
         <w:rPr>
           <w:sz w:val="24"/>
@@ -8679,7 +8284,6 @@
         </w:rPr>
         <w:t xml:space="preserve">Los resultados del estudio resaltan el potencial del </w:t>
       </w:r>
-      <w:proofErr w:type="spellStart"/>
       <w:r>
         <w:rPr>
           <w:sz w:val="24"/>
@@ -8692,15 +8296,7 @@
           <w:sz w:val="24"/>
           <w:szCs w:val="24"/>
         </w:rPr>
-        <w:t>compost</w:t>
-      </w:r>
-      <w:proofErr w:type="spellEnd"/>
-      <w:r>
-        <w:rPr>
-          <w:sz w:val="24"/>
-          <w:szCs w:val="24"/>
-        </w:rPr>
-        <w:t xml:space="preserve"> como una opción sostenible frente a los fertilizantes convencionales en la producción de cultivos.</w:t>
+        <w:t>compost como una opción sostenible frente a los fertilizantes convencionales en la producción de cultivos.</w:t>
       </w:r>
     </w:p>
     <w:p>
@@ -8925,7 +8521,6 @@
         </w:rPr>
         <w:t xml:space="preserve"> el </w:t>
       </w:r>
-      <w:proofErr w:type="spellStart"/>
       <w:r>
         <w:rPr>
           <w:sz w:val="24"/>
@@ -8954,7 +8549,6 @@
         </w:rPr>
         <w:t>je</w:t>
       </w:r>
-      <w:proofErr w:type="spellEnd"/>
       <w:r>
         <w:rPr>
           <w:sz w:val="24"/>
@@ -9121,15 +8715,7 @@
           <w:sz w:val="24"/>
           <w:szCs w:val="24"/>
         </w:rPr>
-        <w:t xml:space="preserve">mediante </w:t>
-      </w:r>
-      <w:proofErr w:type="spellStart"/>
-      <w:r>
-        <w:rPr>
-          <w:sz w:val="24"/>
-          <w:szCs w:val="24"/>
-        </w:rPr>
-        <w:t>l</w:t>
+        <w:t>mediante l</w:t>
       </w:r>
       <w:r>
         <w:rPr>
@@ -9138,7 +8724,6 @@
         </w:rPr>
         <w:t>ombricompostaje</w:t>
       </w:r>
-      <w:proofErr w:type="spellEnd"/>
       <w:r>
         <w:rPr>
           <w:sz w:val="24"/>
@@ -9357,7 +8942,6 @@
         </w:rPr>
         <w:t xml:space="preserve">del sistema de </w:t>
       </w:r>
-      <w:proofErr w:type="spellStart"/>
       <w:r>
         <w:rPr>
           <w:sz w:val="24"/>
@@ -9370,9 +8954,15 @@
           <w:sz w:val="24"/>
           <w:szCs w:val="24"/>
         </w:rPr>
-        <w:t>compostaje</w:t>
-      </w:r>
-      <w:proofErr w:type="spellEnd"/>
+        <w:t xml:space="preserve">compostaje </w:t>
+      </w:r>
+      <w:r>
+        <w:rPr>
+          <w:sz w:val="24"/>
+          <w:szCs w:val="24"/>
+        </w:rPr>
+        <w:t>fueron</w:t>
+      </w:r>
       <w:r>
         <w:rPr>
           <w:sz w:val="24"/>
@@ -9385,39 +8975,8 @@
           <w:sz w:val="24"/>
           <w:szCs w:val="24"/>
         </w:rPr>
-        <w:t>fueron</w:t>
-      </w:r>
-      <w:r>
-        <w:rPr>
-          <w:sz w:val="24"/>
-          <w:szCs w:val="24"/>
-        </w:rPr>
-        <w:t xml:space="preserve"> </w:t>
-      </w:r>
-      <w:r>
-        <w:rPr>
-          <w:sz w:val="24"/>
-          <w:szCs w:val="24"/>
-        </w:rPr>
-        <w:t xml:space="preserve">10,8 g, 62,3 g y 12,8 g por </w:t>
-      </w:r>
-      <w:proofErr w:type="spellStart"/>
-      <w:r>
-        <w:rPr>
-          <w:sz w:val="24"/>
-          <w:szCs w:val="24"/>
-        </w:rPr>
-        <w:t>megagramo</w:t>
-      </w:r>
-      <w:proofErr w:type="spellEnd"/>
-      <w:r>
-        <w:rPr>
-          <w:sz w:val="24"/>
-          <w:szCs w:val="24"/>
-        </w:rPr>
-        <w:t xml:space="preserve"> de residuos orgánicos para metano, óxido nitroso y amoníaco, respectivamente. El </w:t>
-      </w:r>
-      <w:proofErr w:type="spellStart"/>
+        <w:t xml:space="preserve">10,8 g, 62,3 g y 12,8 g por megagramo de residuos orgánicos para metano, óxido nitroso y amoníaco, respectivamente. El </w:t>
+      </w:r>
       <w:r>
         <w:rPr>
           <w:sz w:val="24"/>
@@ -9430,17 +8989,8 @@
           <w:sz w:val="24"/>
           <w:szCs w:val="24"/>
         </w:rPr>
-        <w:t>compostaje</w:t>
-      </w:r>
-      <w:proofErr w:type="spellEnd"/>
-      <w:r>
-        <w:rPr>
-          <w:sz w:val="24"/>
-          <w:szCs w:val="24"/>
-        </w:rPr>
-        <w:t xml:space="preserve"> se desempeñó satisfactoriamente en términos de potencial de calentamiento global y eutrofización. Sin embargo, si el </w:t>
-      </w:r>
-      <w:proofErr w:type="spellStart"/>
+        <w:t xml:space="preserve">compostaje se desempeñó satisfactoriamente en términos de potencial de calentamiento global y eutrofización. Sin embargo, si el </w:t>
+      </w:r>
       <w:r>
         <w:rPr>
           <w:sz w:val="24"/>
@@ -9453,15 +9003,7 @@
           <w:sz w:val="24"/>
           <w:szCs w:val="24"/>
         </w:rPr>
-        <w:t>compost</w:t>
-      </w:r>
-      <w:proofErr w:type="spellEnd"/>
-      <w:r>
-        <w:rPr>
-          <w:sz w:val="24"/>
-          <w:szCs w:val="24"/>
-        </w:rPr>
-        <w:t xml:space="preserve"> generado se desecha de manera inadecuada, </w:t>
+        <w:t xml:space="preserve">compost generado se desecha de manera inadecuada, </w:t>
       </w:r>
       <w:r>
         <w:rPr>
@@ -9525,7 +9067,6 @@
         </w:rPr>
         <w:t xml:space="preserve"> (CH₄, N₂O y NH₃) de sistemas de </w:t>
       </w:r>
-      <w:proofErr w:type="spellStart"/>
       <w:r>
         <w:rPr>
           <w:sz w:val="24"/>
@@ -9538,17 +9079,8 @@
           <w:sz w:val="24"/>
           <w:szCs w:val="24"/>
         </w:rPr>
-        <w:t>compostaje</w:t>
-      </w:r>
-      <w:proofErr w:type="spellEnd"/>
-      <w:r>
-        <w:rPr>
-          <w:sz w:val="24"/>
-          <w:szCs w:val="24"/>
-        </w:rPr>
-        <w:t xml:space="preserve"> que utilizan estiércol bovino como sustrato. Sin embargo, las emisiones se midieron solamente una vez durante un ciclo completo de </w:t>
-      </w:r>
-      <w:proofErr w:type="spellStart"/>
+        <w:t xml:space="preserve">compostaje que utilizan estiércol bovino como sustrato. Sin embargo, las emisiones se midieron solamente una vez durante un ciclo completo de </w:t>
+      </w:r>
       <w:r>
         <w:rPr>
           <w:sz w:val="24"/>
@@ -9561,31 +9093,7 @@
           <w:sz w:val="24"/>
           <w:szCs w:val="24"/>
         </w:rPr>
-        <w:t>compostaje</w:t>
-      </w:r>
-      <w:proofErr w:type="spellEnd"/>
-      <w:r>
-        <w:rPr>
-          <w:sz w:val="24"/>
-          <w:szCs w:val="24"/>
-        </w:rPr>
-        <w:t xml:space="preserve">. Por lo que no se obtuvo información sobre la variación de las emisiones en las distintas etapas del proceso. Por ello, el estudio de </w:t>
-      </w:r>
-      <w:proofErr w:type="spellStart"/>
-      <w:r>
-        <w:rPr>
-          <w:sz w:val="24"/>
-          <w:szCs w:val="24"/>
-        </w:rPr>
-        <w:t>Jjagwe</w:t>
-      </w:r>
-      <w:proofErr w:type="spellEnd"/>
-      <w:r>
-        <w:rPr>
-          <w:sz w:val="24"/>
-          <w:szCs w:val="24"/>
-        </w:rPr>
-        <w:t xml:space="preserve"> et al. (2019) se llevó a cabo para abordar esta limitación</w:t>
+        <w:t>compostaje. Por lo que no se obtuvo información sobre la variación de las emisiones en las distintas etapas del proceso. Por ello, el estudio de Jjagwe et al. (2019) se llevó a cabo para abordar esta limitación</w:t>
       </w:r>
       <w:r>
         <w:rPr>
@@ -9620,22 +9128,7 @@
           <w:szCs w:val="24"/>
         </w:rPr>
         <w:tab/>
-      </w:r>
-      <w:proofErr w:type="spellStart"/>
-      <w:r>
-        <w:rPr>
-          <w:sz w:val="24"/>
-          <w:szCs w:val="24"/>
-        </w:rPr>
-        <w:t>Jjagwe</w:t>
-      </w:r>
-      <w:proofErr w:type="spellEnd"/>
-      <w:r>
-        <w:rPr>
-          <w:sz w:val="24"/>
-          <w:szCs w:val="24"/>
-        </w:rPr>
-        <w:t xml:space="preserve"> et al. (2019) </w:t>
+        <w:t xml:space="preserve">Jjagwe et al. (2019) </w:t>
       </w:r>
       <w:r>
         <w:rPr>
@@ -9686,7 +9179,6 @@
         </w:rPr>
         <w:t xml:space="preserve"> sistema de </w:t>
       </w:r>
-      <w:proofErr w:type="spellStart"/>
       <w:r>
         <w:rPr>
           <w:sz w:val="24"/>
@@ -9699,17 +9191,8 @@
           <w:sz w:val="24"/>
           <w:szCs w:val="24"/>
         </w:rPr>
-        <w:t>compostaje</w:t>
-      </w:r>
-      <w:proofErr w:type="spellEnd"/>
-      <w:r>
-        <w:rPr>
-          <w:sz w:val="24"/>
-          <w:szCs w:val="24"/>
-        </w:rPr>
-        <w:t xml:space="preserve"> que utilizó estiércol bovino y lombrices (</w:t>
-      </w:r>
-      <w:proofErr w:type="spellStart"/>
+        <w:t>compostaje que utilizó estiércol bovino y lombrices (</w:t>
+      </w:r>
       <w:r>
         <w:rPr>
           <w:i/>
@@ -9717,71 +9200,50 @@
           <w:sz w:val="24"/>
           <w:szCs w:val="24"/>
         </w:rPr>
-        <w:t>Eudrilus</w:t>
-      </w:r>
-      <w:proofErr w:type="spellEnd"/>
-      <w:r>
-        <w:rPr>
-          <w:i/>
-          <w:iCs/>
+        <w:t>Eudrilus euginea</w:t>
+      </w:r>
+      <w:r>
+        <w:rPr>
+          <w:sz w:val="24"/>
+          <w:szCs w:val="24"/>
+        </w:rPr>
+        <w:t xml:space="preserve">) fue monitoreado durante un año, cosechando los productos (compost y biomasa de lombrices) cada tres meses. </w:t>
+      </w:r>
+      <w:r>
+        <w:rPr>
+          <w:sz w:val="24"/>
+          <w:szCs w:val="24"/>
+        </w:rPr>
+        <w:t>S</w:t>
+      </w:r>
+      <w:r>
+        <w:rPr>
+          <w:sz w:val="24"/>
+          <w:szCs w:val="24"/>
+        </w:rPr>
+        <w:t xml:space="preserve">e midieron las emisiones </w:t>
+      </w:r>
+      <w:r>
+        <w:rPr>
+          <w:sz w:val="24"/>
+          <w:szCs w:val="24"/>
+        </w:rPr>
+        <w:t xml:space="preserve">directas </w:t>
+      </w:r>
+      <w:r>
+        <w:rPr>
+          <w:sz w:val="24"/>
+          <w:szCs w:val="24"/>
+        </w:rPr>
+        <w:t>de CO₂, CH₄, NH₃ y N₂O. Para determinar los flujos y la retención de nutrientes en el sistema, se aplicó un análisis de flujo de materiales.</w:t>
+      </w:r>
+      <w:r>
+        <w:rPr>
           <w:sz w:val="24"/>
           <w:szCs w:val="24"/>
         </w:rPr>
         <w:t xml:space="preserve"> </w:t>
       </w:r>
-      <w:proofErr w:type="spellStart"/>
-      <w:r>
-        <w:rPr>
-          <w:i/>
-          <w:iCs/>
-          <w:sz w:val="24"/>
-          <w:szCs w:val="24"/>
-        </w:rPr>
-        <w:t>euginea</w:t>
-      </w:r>
-      <w:proofErr w:type="spellEnd"/>
-      <w:r>
-        <w:rPr>
-          <w:sz w:val="24"/>
-          <w:szCs w:val="24"/>
-        </w:rPr>
-        <w:t xml:space="preserve">) fue monitoreado durante un año, cosechando los productos (compost y biomasa de lombrices) cada tres meses. </w:t>
-      </w:r>
-      <w:r>
-        <w:rPr>
-          <w:sz w:val="24"/>
-          <w:szCs w:val="24"/>
-        </w:rPr>
-        <w:t>S</w:t>
-      </w:r>
-      <w:r>
-        <w:rPr>
-          <w:sz w:val="24"/>
-          <w:szCs w:val="24"/>
-        </w:rPr>
-        <w:t xml:space="preserve">e midieron las emisiones </w:t>
-      </w:r>
-      <w:r>
-        <w:rPr>
-          <w:sz w:val="24"/>
-          <w:szCs w:val="24"/>
-        </w:rPr>
-        <w:t xml:space="preserve">directas </w:t>
-      </w:r>
-      <w:r>
-        <w:rPr>
-          <w:sz w:val="24"/>
-          <w:szCs w:val="24"/>
-        </w:rPr>
-        <w:t>de CO₂, CH₄, NH₃ y N₂O. Para determinar los flujos y la retención de nutrientes en el sistema, se aplicó un análisis de flujo de materiales.</w:t>
-      </w:r>
-      <w:r>
-        <w:rPr>
-          <w:sz w:val="24"/>
-          <w:szCs w:val="24"/>
-        </w:rPr>
-        <w:t xml:space="preserve"> </w:t>
-      </w:r>
       <w:r>
         <w:rPr>
           <w:sz w:val="24"/>
@@ -9789,7 +9251,6 @@
         </w:rPr>
         <w:t xml:space="preserve">Del total de materiales ingresados al sistema, el 46 % se convirtió en </w:t>
       </w:r>
-      <w:proofErr w:type="spellStart"/>
       <w:r>
         <w:rPr>
           <w:sz w:val="24"/>
@@ -9802,17 +9263,8 @@
           <w:sz w:val="24"/>
           <w:szCs w:val="24"/>
         </w:rPr>
-        <w:t>compost</w:t>
-      </w:r>
-      <w:proofErr w:type="spellEnd"/>
-      <w:r>
-        <w:rPr>
-          <w:sz w:val="24"/>
-          <w:szCs w:val="24"/>
-        </w:rPr>
-        <w:t xml:space="preserve">, el 2 % en biomasa de lombriz y el 52 % se perdió en la atmósfera. El análisis de flujo de sustancias mostró que el 30 % del carbono se incorporó al </w:t>
-      </w:r>
-      <w:proofErr w:type="spellStart"/>
+        <w:t xml:space="preserve">compost, el 2 % en biomasa de lombriz y el 52 % se perdió en la atmósfera. El análisis de flujo de sustancias mostró que el 30 % del carbono se incorporó al </w:t>
+      </w:r>
       <w:r>
         <w:rPr>
           <w:sz w:val="24"/>
@@ -9825,17 +9277,8 @@
           <w:sz w:val="24"/>
           <w:szCs w:val="24"/>
         </w:rPr>
-        <w:t>compost</w:t>
-      </w:r>
-      <w:proofErr w:type="spellEnd"/>
-      <w:r>
-        <w:rPr>
-          <w:sz w:val="24"/>
-          <w:szCs w:val="24"/>
-        </w:rPr>
-        <w:t xml:space="preserve">, el 69 % se emitió a la atmósfera y el 2 % se acumuló en las lombrices. En cuanto al nitrógeno, el 75 % se transfirió al </w:t>
-      </w:r>
-      <w:proofErr w:type="spellStart"/>
+        <w:t xml:space="preserve">compost, el 69 % se emitió a la atmósfera y el 2 % se acumuló en las lombrices. En cuanto al nitrógeno, el 75 % se transfirió al </w:t>
+      </w:r>
       <w:r>
         <w:rPr>
           <w:sz w:val="24"/>
@@ -9848,15 +9291,7 @@
           <w:sz w:val="24"/>
           <w:szCs w:val="24"/>
         </w:rPr>
-        <w:t>compost</w:t>
-      </w:r>
-      <w:proofErr w:type="spellEnd"/>
-      <w:r>
-        <w:rPr>
-          <w:sz w:val="24"/>
-          <w:szCs w:val="24"/>
-        </w:rPr>
-        <w:t>, el 7 % a las lombrices y el 18 % se liberó a la atmósfera.</w:t>
+        <w:t>compost, el 7 % a las lombrices y el 18 % se liberó a la atmósfera.</w:t>
       </w:r>
     </w:p>
     <w:p>
@@ -9920,7 +9355,6 @@
         </w:rPr>
         <w:t xml:space="preserve">943 × 10⁻⁵ g N₂O kg⁻¹ de residuo en base seca, mientras que no se detectó NH₃ durante el periodo de medición. En comparación con otros métodos de manejo de estiércol, el </w:t>
       </w:r>
-      <w:proofErr w:type="spellStart"/>
       <w:r>
         <w:rPr>
           <w:sz w:val="24"/>
@@ -9933,15 +9367,7 @@
           <w:sz w:val="24"/>
           <w:szCs w:val="24"/>
         </w:rPr>
-        <w:t>icompostaje</w:t>
-      </w:r>
-      <w:proofErr w:type="spellEnd"/>
-      <w:r>
-        <w:rPr>
-          <w:sz w:val="24"/>
-          <w:szCs w:val="24"/>
-        </w:rPr>
-        <w:t xml:space="preserve"> mostró un buen potencial para conservar nutrientes y reducir la emisión de gases de efecto invernadero.</w:t>
+        <w:t>icompostaje mostró un buen potencial para conservar nutrientes y reducir la emisión de gases de efecto invernadero.</w:t>
       </w:r>
       <w:r>
         <w:rPr>
@@ -10045,71 +9471,7 @@
           <w:sz w:val="24"/>
           <w:szCs w:val="24"/>
         </w:rPr>
-        <w:t xml:space="preserve">Arfelli et al. (2023) evaluaron el impacto ambiental de convertir residuos agrícolas y ganaderos en acondicionador de suelo mediante digestión anaerobia (DA) y </w:t>
-      </w:r>
-      <w:proofErr w:type="spellStart"/>
-      <w:r>
-        <w:rPr>
-          <w:sz w:val="24"/>
-          <w:szCs w:val="24"/>
-        </w:rPr>
-        <w:t>lombricompostaje</w:t>
-      </w:r>
-      <w:proofErr w:type="spellEnd"/>
-      <w:r>
-        <w:rPr>
-          <w:sz w:val="24"/>
-          <w:szCs w:val="24"/>
-        </w:rPr>
-        <w:t xml:space="preserve">, comparando con dos escenarios alternativos: uno en el que la cogeneración de energía se reemplazó por la mejora de biometano y otro que consideró la extracción y uso de turba como alternativa comercial no renovable. El análisis incluyó la infraestructura, transporte, insumos, consumo de diésel y electricidad, emisiones atmosféricas y generación in situ de energía renovable, excluyendo residuos menores al 1%. Se utilizaron datos primarios de una empresa productora y secundarios de bases especializadas, estimando el consumo energético con un enfoque de abajo hacia arriba. La Evaluación del Ciclo de Vida (EICV) empleó el método </w:t>
-      </w:r>
-      <w:proofErr w:type="spellStart"/>
-      <w:r>
-        <w:rPr>
-          <w:sz w:val="24"/>
-          <w:szCs w:val="24"/>
-        </w:rPr>
-        <w:t>ReCiPe</w:t>
-      </w:r>
-      <w:proofErr w:type="spellEnd"/>
-      <w:r>
-        <w:rPr>
-          <w:sz w:val="24"/>
-          <w:szCs w:val="24"/>
-        </w:rPr>
-        <w:t xml:space="preserve"> 2016 para analizar 18 categorías de impacto, destacando calentamiento global y partículas en suspensión. Los resultados mostraron que el acondicionador de suelo tuvo un mejor desempeño ambiental en 15 categorías, logrando una reducción de 397 kg CO₂ </w:t>
-      </w:r>
-      <w:proofErr w:type="spellStart"/>
-      <w:r>
-        <w:rPr>
-          <w:sz w:val="24"/>
-          <w:szCs w:val="24"/>
-        </w:rPr>
-        <w:t>eq</w:t>
-      </w:r>
-      <w:proofErr w:type="spellEnd"/>
-      <w:r>
-        <w:rPr>
-          <w:sz w:val="24"/>
-          <w:szCs w:val="24"/>
-        </w:rPr>
-        <w:t xml:space="preserve">/ton frente al uso de turba y 165 kg CO₂ </w:t>
-      </w:r>
-      <w:proofErr w:type="spellStart"/>
-      <w:r>
-        <w:rPr>
-          <w:sz w:val="24"/>
-          <w:szCs w:val="24"/>
-        </w:rPr>
-        <w:t>eq</w:t>
-      </w:r>
-      <w:proofErr w:type="spellEnd"/>
-      <w:r>
-        <w:rPr>
-          <w:sz w:val="24"/>
-          <w:szCs w:val="24"/>
-        </w:rPr>
-        <w:t xml:space="preserve">/ton respecto a la mejora de </w:t>
+        <w:t xml:space="preserve">Arfelli et al. (2023) evaluaron el impacto ambiental de convertir residuos agrícolas y ganaderos en acondicionador de suelo mediante digestión anaerobia (DA) y lombricompostaje, comparando con dos escenarios alternativos: uno en el que la cogeneración de energía se reemplazó por la mejora de biometano y otro que consideró la extracción y uso de turba como alternativa comercial no renovable. El análisis incluyó la infraestructura, transporte, insumos, consumo de diésel y electricidad, emisiones atmosféricas y generación in situ de energía renovable, excluyendo residuos menores al 1%. Se utilizaron datos primarios de una empresa productora y secundarios de bases especializadas, estimando el consumo energético con un enfoque de abajo hacia arriba. La Evaluación del Ciclo de Vida (EICV) empleó el método ReCiPe 2016 para analizar 18 categorías de impacto, destacando calentamiento global y partículas en suspensión. Los resultados mostraron que el acondicionador de suelo tuvo un mejor desempeño ambiental en 15 categorías, logrando una reducción de 397 kg CO₂ eq/ton frente al uso de turba y 165 kg CO₂ eq/ton respecto a la mejora de </w:t>
       </w:r>
       <w:r>
         <w:rPr>
@@ -10370,30 +9732,14 @@
           <w:sz w:val="24"/>
           <w:szCs w:val="24"/>
         </w:rPr>
-        <w:t xml:space="preserve"> </w:t>
-      </w:r>
-      <w:proofErr w:type="spellStart"/>
-      <w:r>
-        <w:rPr>
-          <w:sz w:val="24"/>
-          <w:szCs w:val="24"/>
-        </w:rPr>
-        <w:t>lombricompost</w:t>
-      </w:r>
-      <w:r>
-        <w:rPr>
-          <w:sz w:val="24"/>
-          <w:szCs w:val="24"/>
-        </w:rPr>
-        <w:t>aje</w:t>
-      </w:r>
-      <w:proofErr w:type="spellEnd"/>
-      <w:r>
-        <w:rPr>
-          <w:sz w:val="24"/>
-          <w:szCs w:val="24"/>
-        </w:rPr>
-        <w:t xml:space="preserve"> y el aplicado como purines directamente en los campos de pastoreo.</w:t>
+        <w:t xml:space="preserve"> lombricompost</w:t>
+      </w:r>
+      <w:r>
+        <w:rPr>
+          <w:sz w:val="24"/>
+          <w:szCs w:val="24"/>
+        </w:rPr>
+        <w:t>aje y el aplicado como purines directamente en los campos de pastoreo.</w:t>
       </w:r>
     </w:p>
     <w:p>
@@ -10449,30 +9795,14 @@
           <w:sz w:val="24"/>
           <w:szCs w:val="24"/>
         </w:rPr>
-        <w:t xml:space="preserve"> </w:t>
-      </w:r>
-      <w:proofErr w:type="spellStart"/>
-      <w:r>
-        <w:rPr>
-          <w:sz w:val="24"/>
-          <w:szCs w:val="24"/>
-        </w:rPr>
-        <w:t>lombricompost</w:t>
-      </w:r>
-      <w:r>
-        <w:rPr>
-          <w:sz w:val="24"/>
-          <w:szCs w:val="24"/>
-        </w:rPr>
-        <w:t>aje</w:t>
-      </w:r>
-      <w:proofErr w:type="spellEnd"/>
-      <w:r>
-        <w:rPr>
-          <w:sz w:val="24"/>
-          <w:szCs w:val="24"/>
-        </w:rPr>
-        <w:t xml:space="preserve"> y</w:t>
+        <w:t xml:space="preserve"> lombricompost</w:t>
+      </w:r>
+      <w:r>
+        <w:rPr>
+          <w:sz w:val="24"/>
+          <w:szCs w:val="24"/>
+        </w:rPr>
+        <w:t>aje y</w:t>
       </w:r>
       <w:r>
         <w:rPr>
@@ -10588,8 +9918,6 @@
           <w:szCs w:val="24"/>
         </w:rPr>
       </w:pPr>
-      <w:proofErr w:type="spellStart"/>
-      <w:proofErr w:type="spellEnd"/>
       <w:r>
         <w:rPr>
           <w:sz w:val="24"/>
@@ -10745,16 +10073,6 @@
           <w:szCs w:val="24"/>
         </w:rPr>
       </w:pPr>
-      <w:proofErr w:type="spellStart"/>
-      <w:proofErr w:type="spellEnd"/>
-      <w:proofErr w:type="spellStart"/>
-      <w:proofErr w:type="spellEnd"/>
-      <w:proofErr w:type="spellStart"/>
-      <w:proofErr w:type="spellEnd"/>
-      <w:proofErr w:type="spellStart"/>
-      <w:proofErr w:type="spellEnd"/>
-      <w:proofErr w:type="spellStart"/>
-      <w:proofErr w:type="spellEnd"/>
       <w:r>
         <w:rPr>
           <w:sz w:val="24"/>
@@ -10789,14 +10107,19 @@
           <w:highlight w:val="yellow"/>
         </w:rPr>
       </w:pPr>
-      <w:proofErr w:type="spellStart"/>
-      <w:proofErr w:type="spellEnd"/>
       <w:r>
         <w:rPr>
           <w:sz w:val="24"/>
         </w:rPr>
         <w:tab/>
-        <w:t>Los residuos sólidos se recolectaron durante la limpieza del área de estancia de los bovinos, donde los animales permanecieron antes o después de las labores rutinarias de manejo. La recolección se efectuó manualmente con palas y el material se transportó en cubetas hacia la zona de precompostaje. Los residuos líquidos y sólidos remanentes se arrastraron durante el lavado del piso con agua, lo que generó aguas verdes. Estas aguas se condujeron por gravedad hacia un tanque de almacenamiento, donde permanecieron durante dos o tres días antes de su aplicación en campo.</w:t>
+        <w:t xml:space="preserve">Los residuos sólidos se recolectaron durante la limpieza del área de estancia de los bovinos, donde los animales permanecieron antes o después de las labores rutinarias de manejo. La recolección se efectuó manualmente con palas y el material se transportó en cubetas hacia la zona de precompostaje. Los residuos líquidos y sólidos remanentes se arrastraron durante el lavado del piso </w:t>
+      </w:r>
+      <w:r>
+        <w:rPr>
+          <w:sz w:val="24"/>
+        </w:rPr>
+        <w:lastRenderedPageBreak/>
+        <w:t>con agua, lo que generó aguas verdes. Estas aguas se condujeron por gravedad hacia un tanque de almacenamiento, donde permanecieron durante dos o tres días antes de su aplicación en campo.</w:t>
       </w:r>
     </w:p>
     <w:p>
@@ -10824,8 +10147,6 @@
           <w:szCs w:val="24"/>
         </w:rPr>
       </w:pPr>
-      <w:proofErr w:type="spellStart"/>
-      <w:proofErr w:type="spellEnd"/>
       <w:r>
         <w:rPr>
           <w:sz w:val="24"/>
@@ -10931,8 +10252,6 @@
           <w:szCs w:val="24"/>
         </w:rPr>
       </w:pPr>
-      <w:proofErr w:type="spellStart"/>
-      <w:proofErr w:type="spellEnd"/>
       <w:r>
         <w:rPr>
           <w:sz w:val="24"/>
@@ -11316,19 +10635,8 @@
           <w:sz w:val="24"/>
           <w:szCs w:val="24"/>
         </w:rPr>
-        <w:t xml:space="preserve">Sistema de </w:t>
-      </w:r>
-      <w:proofErr w:type="spellStart"/>
-      <w:r>
-        <w:rPr>
-          <w:b/>
-          <w:bCs/>
-          <w:sz w:val="24"/>
-          <w:szCs w:val="24"/>
-        </w:rPr>
-        <w:t>lombricompostaje</w:t>
-      </w:r>
-      <w:proofErr w:type="spellEnd"/>
+        <w:t>Sistema de lombricompostaje</w:t>
+      </w:r>
     </w:p>
     <w:p>
       <w:pPr>
@@ -11349,14 +10657,6 @@
           <w:szCs w:val="24"/>
         </w:rPr>
       </w:pPr>
-      <w:proofErr w:type="spellStart"/>
-      <w:proofErr w:type="spellEnd"/>
-      <w:proofErr w:type="spellStart"/>
-      <w:proofErr w:type="spellEnd"/>
-      <w:proofErr w:type="spellStart"/>
-      <w:proofErr w:type="spellEnd"/>
-      <w:proofErr w:type="spellStart"/>
-      <w:proofErr w:type="spellEnd"/>
       <w:r>
         <w:rPr>
           <w:sz w:val="24"/>
@@ -11453,7 +10753,6 @@
           <w:sz w:val="24"/>
           <w:szCs w:val="24"/>
         </w:rPr>
-        <w:lastRenderedPageBreak/>
         <w:t>Figura 1</w:t>
       </w:r>
     </w:p>
@@ -11485,27 +10784,7 @@
           <w:sz w:val="24"/>
           <w:szCs w:val="24"/>
         </w:rPr>
-        <w:t xml:space="preserve">Diagrama esquemático que muestra los límites del sistema de </w:t>
-      </w:r>
-      <w:proofErr w:type="spellStart"/>
-      <w:r>
-        <w:rPr>
-          <w:i/>
-          <w:iCs/>
-          <w:sz w:val="24"/>
-          <w:szCs w:val="24"/>
-        </w:rPr>
-        <w:t>lombricompostaje</w:t>
-      </w:r>
-      <w:proofErr w:type="spellEnd"/>
-      <w:r>
-        <w:rPr>
-          <w:i/>
-          <w:iCs/>
-          <w:sz w:val="24"/>
-          <w:szCs w:val="24"/>
-        </w:rPr>
-        <w:t xml:space="preserve"> (Escenario A)</w:t>
+        <w:t>Diagrama esquemático que muestra los límites del sistema de lombricompostaje (Escenario A)</w:t>
       </w:r>
     </w:p>
     <w:p>
@@ -11535,6 +10814,7 @@
           <w:szCs w:val="24"/>
           <w:lang w:val="en-US"/>
         </w:rPr>
+        <w:lastRenderedPageBreak/>
         <w:drawing>
           <wp:inline distT="0" distB="0" distL="0" distR="0" wp14:anchorId="0D8B63FA" wp14:editId="52383E28">
             <wp:extent cx="4983591" cy="2838292"/>
@@ -11742,8 +11022,6 @@
           <w:szCs w:val="24"/>
         </w:rPr>
       </w:pPr>
-      <w:proofErr w:type="spellStart"/>
-      <w:proofErr w:type="spellEnd"/>
       <w:r>
         <w:rPr>
           <w:sz w:val="24"/>
@@ -11863,7 +11141,7 @@
           <w:noProof/>
         </w:rPr>
         <w:drawing>
-          <wp:inline distT="0" distB="0" distL="0" distR="0" wp14:anchorId="01FF7C85" wp14:editId="258CEA86">
+          <wp:inline distT="0" distB="0" distL="0" distR="0" wp14:anchorId="01FF7C85" wp14:editId="3F9E39F9">
             <wp:extent cx="4079019" cy="2701234"/>
             <wp:effectExtent l="0" t="0" r="0" b="4445"/>
             <wp:docPr id="1247949660" name="Imagen 2" descr="Diagrama&#10;&#10;El contenido generado por IA puede ser incorrecto."/>
@@ -11945,7 +11223,6 @@
           <w:sz w:val="24"/>
           <w:szCs w:val="24"/>
         </w:rPr>
-        <w:lastRenderedPageBreak/>
         <w:t>5</w:t>
       </w:r>
       <w:r>
@@ -12013,16 +11290,19 @@
           <w:szCs w:val="24"/>
         </w:rPr>
       </w:pPr>
-      <w:proofErr w:type="spellStart"/>
-      <w:proofErr w:type="spellEnd"/>
-      <w:proofErr w:type="spellStart"/>
-      <w:proofErr w:type="spellEnd"/>
       <w:r>
         <w:rPr>
           <w:sz w:val="24"/>
         </w:rPr>
         <w:tab/>
-        <w:t>El inventario de ciclo de vida (ICV) se elaboró para las etapas de cada escenario. En el Escenario A se incluyeron el precomposteo, el lombricompostaje, el almacenamiento de aguas verdes y la aplicación de aguas verdes en campo. En el Escenario B se incluyeron el almacenamiento de purines y su aplicación en campo. Para cada etapa se identificaron los flujos de entrada y salida relevantes, así como los factores de emisión más representativos y cercanos a las condiciones del área de estudio, con base en datos de la lechería, análisis de laboratorio y revisión bibliográfica.</w:t>
+        <w:t xml:space="preserve">El inventario de ciclo de vida (ICV) se elaboró para las etapas de cada escenario. En el </w:t>
+      </w:r>
+      <w:r>
+        <w:rPr>
+          <w:sz w:val="24"/>
+        </w:rPr>
+        <w:lastRenderedPageBreak/>
+        <w:t>Escenario A se incluyeron el precomposteo, el lombricompostaje, el almacenamiento de aguas verdes y la aplicación de aguas verdes en campo. En el Escenario B se incluyeron el almacenamiento de purines y su aplicación en campo. Para cada etapa se identificaron los flujos de entrada y salida relevantes, así como los factores de emisión más representativos y cercanos a las condiciones del área de estudio, con base en datos de la lechería, análisis de laboratorio y revisión bibliográfica.</w:t>
       </w:r>
     </w:p>
     <w:p>
@@ -12044,12 +11324,6 @@
           <w:szCs w:val="24"/>
         </w:rPr>
       </w:pPr>
-      <w:proofErr w:type="spellStart"/>
-      <w:proofErr w:type="spellEnd"/>
-      <w:proofErr w:type="spellStart"/>
-      <w:proofErr w:type="spellEnd"/>
-      <w:proofErr w:type="spellStart"/>
-      <w:proofErr w:type="spellEnd"/>
       <w:r>
         <w:rPr>
           <w:sz w:val="24"/>
@@ -12094,10 +11368,6 @@
           <w:highlight w:val="yellow"/>
         </w:rPr>
       </w:pPr>
-      <w:proofErr w:type="spellStart"/>
-      <w:proofErr w:type="spellEnd"/>
-      <w:proofErr w:type="spellStart"/>
-      <w:proofErr w:type="spellEnd"/>
       <w:r>
         <w:rPr>
           <w:sz w:val="24"/>
@@ -12211,7 +11481,6 @@
         <w:rPr>
           <w:sz w:val="24"/>
         </w:rPr>
-        <w:tab/>
         <w:t>Las ecuaciones 7 a 13 se utilizaron para estimar las fracciones remanentes de nitrógeno después de la transformación a N</w:t>
       </w:r>
       <w:r>
@@ -12333,7 +11602,6 @@
         <w:rPr>
           <w:sz w:val="24"/>
         </w:rPr>
-        <w:tab/>
         <w:t>Finalmente, las ecuaciones 22 a 24 se emplearon para estimar el nitrógeno disponible en el suelo, la fracción total de nitrógeno perdido y la fracción perdida como N</w:t>
       </w:r>
       <w:r>
@@ -12360,7 +11628,6 @@
           <w:highlight w:val="yellow"/>
         </w:rPr>
       </w:pPr>
-      <w:r/>
     </w:p>
     <w:p>
       <w:pPr>
@@ -12372,7 +11639,6 @@
           <w:highlight w:val="yellow"/>
         </w:rPr>
       </w:pPr>
-      <w:r/>
     </w:p>
     <w:p>
       <w:pPr>
@@ -12384,7 +11650,6 @@
           <w:highlight w:val="yellow"/>
         </w:rPr>
       </w:pPr>
-      <w:r/>
     </w:p>
     <w:p>
       <w:pPr>
@@ -12395,7 +11660,6 @@
           <w:szCs w:val="24"/>
         </w:rPr>
       </w:pPr>
-      <w:r/>
     </w:p>
     <w:p>
       <w:pPr>
@@ -12489,6 +11753,7 @@
         <w:rPr>
           <w:sz w:val="24"/>
         </w:rPr>
+        <w:lastRenderedPageBreak/>
         <w:tab/>
         <w:t>La evaluación del impacto de ciclo de vida (EICV) se realizó para el potencial de calentamiento global y el potencial de eutrofización. Primero, los flujos del ICV se clasificaron según la categoría de impacto a la que contribuyeron. Posteriormente, las emisiones estimadas se caracterizaron mediante la multiplicación de cada flujo por los factores de caracterización reportados en el Apéndice B (Tabla B1). Los resultados se expresaron como indicadores de punto medio en unidades equivalentes de CO</w:t>
       </w:r>
@@ -12547,11 +11812,6 @@
           <w:szCs w:val="24"/>
         </w:rPr>
       </w:pPr>
-      <w:r>
-        <w:rPr>
-          <w:sz w:val="24"/>
-        </w:rPr>
-      </w:r>
     </w:p>
     <w:p>
       <w:pPr>
@@ -12648,11 +11908,6 @@
           <w:szCs w:val="24"/>
         </w:rPr>
       </w:pPr>
-      <w:r>
-        <w:rPr>
-          <w:sz w:val="24"/>
-        </w:rPr>
-      </w:r>
     </w:p>
     <w:p>
       <w:pPr>
@@ -13363,91 +12618,20 @@
         </w:rPr>
         <w:t xml:space="preserve">, </w:t>
       </w:r>
-      <w:proofErr w:type="spellStart"/>
-      <w:r>
-        <w:rPr>
-          <w:sz w:val="24"/>
-          <w:szCs w:val="24"/>
-        </w:rPr>
-        <w:t>Universitat</w:t>
-      </w:r>
-      <w:proofErr w:type="spellEnd"/>
-      <w:r>
-        <w:rPr>
-          <w:sz w:val="24"/>
-          <w:szCs w:val="24"/>
-        </w:rPr>
-        <w:t xml:space="preserve"> </w:t>
-      </w:r>
-      <w:proofErr w:type="spellStart"/>
-      <w:r>
-        <w:rPr>
-          <w:sz w:val="24"/>
-          <w:szCs w:val="24"/>
-        </w:rPr>
-        <w:t>Politècnica</w:t>
-      </w:r>
-      <w:proofErr w:type="spellEnd"/>
-      <w:r>
-        <w:rPr>
-          <w:sz w:val="24"/>
-          <w:szCs w:val="24"/>
-        </w:rPr>
-        <w:t xml:space="preserve"> de Catalunya. </w:t>
-      </w:r>
-      <w:proofErr w:type="spellStart"/>
+      <w:r>
+        <w:rPr>
+          <w:sz w:val="24"/>
+          <w:szCs w:val="24"/>
+        </w:rPr>
+        <w:t xml:space="preserve">Universitat Politècnica de Catalunya. </w:t>
+      </w:r>
       <w:r>
         <w:rPr>
           <w:sz w:val="24"/>
           <w:szCs w:val="24"/>
           <w:lang w:val="en-US"/>
         </w:rPr>
-        <w:t>Departament</w:t>
-      </w:r>
-      <w:proofErr w:type="spellEnd"/>
-      <w:r>
-        <w:rPr>
-          <w:sz w:val="24"/>
-          <w:szCs w:val="24"/>
-          <w:lang w:val="en-US"/>
-        </w:rPr>
-        <w:t xml:space="preserve"> de </w:t>
-      </w:r>
-      <w:proofErr w:type="spellStart"/>
-      <w:r>
-        <w:rPr>
-          <w:sz w:val="24"/>
-          <w:szCs w:val="24"/>
-          <w:lang w:val="en-US"/>
-        </w:rPr>
-        <w:t>Projectes</w:t>
-      </w:r>
-      <w:proofErr w:type="spellEnd"/>
-      <w:r>
-        <w:rPr>
-          <w:sz w:val="24"/>
-          <w:szCs w:val="24"/>
-          <w:lang w:val="en-US"/>
-        </w:rPr>
-        <w:t xml:space="preserve"> </w:t>
-      </w:r>
-      <w:proofErr w:type="spellStart"/>
-      <w:r>
-        <w:rPr>
-          <w:sz w:val="24"/>
-          <w:szCs w:val="24"/>
-          <w:lang w:val="en-US"/>
-        </w:rPr>
-        <w:t>d'Enginyeria</w:t>
-      </w:r>
-      <w:proofErr w:type="spellEnd"/>
-      <w:r>
-        <w:rPr>
-          <w:sz w:val="24"/>
-          <w:szCs w:val="24"/>
-          <w:lang w:val="en-US"/>
-        </w:rPr>
-        <w:t>]</w:t>
+        <w:t>Departament de Projectes d'Enginyeria]</w:t>
       </w:r>
       <w:r>
         <w:rPr>
@@ -13491,41 +12675,13 @@
           <w:lang w:val="en-US"/>
         </w:rPr>
       </w:pPr>
-      <w:proofErr w:type="spellStart"/>
       <w:r>
         <w:rPr>
           <w:sz w:val="24"/>
           <w:szCs w:val="24"/>
           <w:lang w:val="en-US"/>
         </w:rPr>
-        <w:t>Arfelli</w:t>
-      </w:r>
-      <w:proofErr w:type="spellEnd"/>
-      <w:r>
-        <w:rPr>
-          <w:sz w:val="24"/>
-          <w:szCs w:val="24"/>
-          <w:lang w:val="en-US"/>
-        </w:rPr>
-        <w:t xml:space="preserve">, F., Cespi, D., Ciacci, L., &amp; </w:t>
-      </w:r>
-      <w:proofErr w:type="spellStart"/>
-      <w:r>
-        <w:rPr>
-          <w:sz w:val="24"/>
-          <w:szCs w:val="24"/>
-          <w:lang w:val="en-US"/>
-        </w:rPr>
-        <w:t>Passarini</w:t>
-      </w:r>
-      <w:proofErr w:type="spellEnd"/>
-      <w:r>
-        <w:rPr>
-          <w:sz w:val="24"/>
-          <w:szCs w:val="24"/>
-          <w:lang w:val="en-US"/>
-        </w:rPr>
-        <w:t>, F. (2023). Application of life cycle assessment to high-soil conditioner production from biowaste. </w:t>
+        <w:t>Arfelli, F., Cespi, D., Ciacci, L., &amp; Passarini, F. (2023). Application of life cycle assessment to high-soil conditioner production from biowaste. </w:t>
       </w:r>
       <w:r>
         <w:rPr>
@@ -13910,19 +13066,8 @@
           <w:sz w:val="24"/>
           <w:szCs w:val="24"/>
         </w:rPr>
-        <w:t xml:space="preserve">Frisona </w:t>
-      </w:r>
-      <w:proofErr w:type="spellStart"/>
-      <w:r>
-        <w:rPr>
-          <w:i/>
-          <w:iCs/>
-          <w:sz w:val="24"/>
-          <w:szCs w:val="24"/>
-        </w:rPr>
-        <w:t>Espanola</w:t>
-      </w:r>
-      <w:proofErr w:type="spellEnd"/>
+        <w:t>Frisona Espanola</w:t>
+      </w:r>
       <w:r>
         <w:rPr>
           <w:sz w:val="24"/>
@@ -14140,7 +13285,6 @@
           <w:szCs w:val="24"/>
         </w:rPr>
       </w:pPr>
-      <w:proofErr w:type="spellStart"/>
       <w:r>
         <w:rPr>
           <w:rStyle w:val="Hyperlink"/>
@@ -14150,43 +13294,7 @@
           <w:u w:val="none"/>
           <w:lang w:val="en-US"/>
         </w:rPr>
-        <w:t>Ecobilan</w:t>
-      </w:r>
-      <w:proofErr w:type="spellEnd"/>
-      <w:r>
-        <w:rPr>
-          <w:rStyle w:val="Hyperlink"/>
-          <w:color w:val="auto"/>
-          <w:sz w:val="24"/>
-          <w:szCs w:val="24"/>
-          <w:u w:val="none"/>
-          <w:lang w:val="en-US"/>
-        </w:rPr>
-        <w:t xml:space="preserve"> Group. (1999). TEAM. Tools for Environmental Analysis and Management [Conjunto de </w:t>
-      </w:r>
-      <w:proofErr w:type="spellStart"/>
-      <w:r>
-        <w:rPr>
-          <w:rStyle w:val="Hyperlink"/>
-          <w:color w:val="auto"/>
-          <w:sz w:val="24"/>
-          <w:szCs w:val="24"/>
-          <w:u w:val="none"/>
-          <w:lang w:val="en-US"/>
-        </w:rPr>
-        <w:t>datos</w:t>
-      </w:r>
-      <w:proofErr w:type="spellEnd"/>
-      <w:r>
-        <w:rPr>
-          <w:rStyle w:val="Hyperlink"/>
-          <w:color w:val="auto"/>
-          <w:sz w:val="24"/>
-          <w:szCs w:val="24"/>
-          <w:u w:val="none"/>
-          <w:lang w:val="en-US"/>
-        </w:rPr>
-        <w:t xml:space="preserve">]. </w:t>
+        <w:t xml:space="preserve">Ecobilan Group. (1999). TEAM. Tools for Environmental Analysis and Management [Conjunto de datos]. </w:t>
       </w:r>
       <w:r>
         <w:rPr>
@@ -14229,7 +13337,6 @@
           <w:szCs w:val="24"/>
         </w:rPr>
       </w:pPr>
-      <w:proofErr w:type="spellStart"/>
       <w:r>
         <w:rPr>
           <w:sz w:val="24"/>
@@ -14237,7 +13344,6 @@
         </w:rPr>
         <w:t>Fernandez</w:t>
       </w:r>
-      <w:proofErr w:type="spellEnd"/>
       <w:r>
         <w:rPr>
           <w:sz w:val="24"/>
@@ -14463,43 +13569,7 @@
           <w:szCs w:val="24"/>
           <w:lang w:val="en-US"/>
         </w:rPr>
-        <w:t xml:space="preserve">Hou, Y., </w:t>
-      </w:r>
-      <w:proofErr w:type="spellStart"/>
-      <w:r>
-        <w:rPr>
-          <w:sz w:val="24"/>
-          <w:szCs w:val="24"/>
-          <w:lang w:val="en-US"/>
-        </w:rPr>
-        <w:t>Velthof</w:t>
-      </w:r>
-      <w:proofErr w:type="spellEnd"/>
-      <w:r>
-        <w:rPr>
-          <w:sz w:val="24"/>
-          <w:szCs w:val="24"/>
-          <w:lang w:val="en-US"/>
-        </w:rPr>
-        <w:t xml:space="preserve">, G. L., &amp; </w:t>
-      </w:r>
-      <w:proofErr w:type="spellStart"/>
-      <w:r>
-        <w:rPr>
-          <w:sz w:val="24"/>
-          <w:szCs w:val="24"/>
-          <w:lang w:val="en-US"/>
-        </w:rPr>
-        <w:t>Oenema</w:t>
-      </w:r>
-      <w:proofErr w:type="spellEnd"/>
-      <w:r>
-        <w:rPr>
-          <w:sz w:val="24"/>
-          <w:szCs w:val="24"/>
-          <w:lang w:val="en-US"/>
-        </w:rPr>
-        <w:t>, O. (2015). Mitigation of ammonia, nitrous oxide and methane emissions from manure management chains: a meta-analysis and integrated assessment. </w:t>
+        <w:t>Hou, Y., Velthof, G. L., &amp; Oenema, O. (2015). Mitigation of ammonia, nitrous oxide and methane emissions from manure management chains: a meta-analysis and integrated assessment. </w:t>
       </w:r>
       <w:r>
         <w:rPr>
@@ -14508,39 +13578,8 @@
           <w:sz w:val="24"/>
           <w:szCs w:val="24"/>
         </w:rPr>
-        <w:t xml:space="preserve">Global </w:t>
-      </w:r>
-      <w:proofErr w:type="spellStart"/>
-      <w:r>
-        <w:rPr>
-          <w:i/>
-          <w:iCs/>
-          <w:sz w:val="24"/>
-          <w:szCs w:val="24"/>
-        </w:rPr>
-        <w:t>change</w:t>
-      </w:r>
-      <w:proofErr w:type="spellEnd"/>
-      <w:r>
-        <w:rPr>
-          <w:i/>
-          <w:iCs/>
-          <w:sz w:val="24"/>
-          <w:szCs w:val="24"/>
-        </w:rPr>
-        <w:t xml:space="preserve"> </w:t>
-      </w:r>
-      <w:proofErr w:type="spellStart"/>
-      <w:r>
-        <w:rPr>
-          <w:i/>
-          <w:iCs/>
-          <w:sz w:val="24"/>
-          <w:szCs w:val="24"/>
-        </w:rPr>
-        <w:t>biology</w:t>
-      </w:r>
-      <w:proofErr w:type="spellEnd"/>
+        <w:t>Global change biology</w:t>
+      </w:r>
       <w:r>
         <w:rPr>
           <w:sz w:val="24"/>
@@ -14828,23 +13867,13 @@
           <w:lang w:val="en-US"/>
         </w:rPr>
       </w:pPr>
-      <w:proofErr w:type="spellStart"/>
       <w:r>
         <w:rPr>
           <w:sz w:val="24"/>
           <w:szCs w:val="24"/>
           <w:lang w:val="en-US"/>
         </w:rPr>
-        <w:t>Jjagwe</w:t>
-      </w:r>
-      <w:proofErr w:type="spellEnd"/>
-      <w:r>
-        <w:rPr>
-          <w:sz w:val="24"/>
-          <w:szCs w:val="24"/>
-          <w:lang w:val="en-US"/>
-        </w:rPr>
-        <w:t>, J., Komakech, A. J., Karungi, J., Amann, A., Wanyama, J., &amp; Lederer, J. (2019). Assessment of a cattle manure vermicomposting system using material flow analysis: a case study from Uganda. </w:t>
+        <w:t>Jjagwe, J., Komakech, A. J., Karungi, J., Amann, A., Wanyama, J., &amp; Lederer, J. (2019). Assessment of a cattle manure vermicomposting system using material flow analysis: a case study from Uganda. </w:t>
       </w:r>
       <w:r>
         <w:rPr>
@@ -14913,97 +13942,7 @@
           <w:szCs w:val="24"/>
           <w:lang w:val="en-US"/>
         </w:rPr>
-        <w:t xml:space="preserve">Komakech, A. J., </w:t>
-      </w:r>
-      <w:proofErr w:type="spellStart"/>
-      <w:r>
-        <w:rPr>
-          <w:sz w:val="24"/>
-          <w:szCs w:val="24"/>
-          <w:lang w:val="en-US"/>
-        </w:rPr>
-        <w:t>Banadda</w:t>
-      </w:r>
-      <w:proofErr w:type="spellEnd"/>
-      <w:r>
-        <w:rPr>
-          <w:sz w:val="24"/>
-          <w:szCs w:val="24"/>
-          <w:lang w:val="en-US"/>
-        </w:rPr>
-        <w:t xml:space="preserve">, N. E., </w:t>
-      </w:r>
-      <w:proofErr w:type="spellStart"/>
-      <w:r>
-        <w:rPr>
-          <w:sz w:val="24"/>
-          <w:szCs w:val="24"/>
-          <w:lang w:val="en-US"/>
-        </w:rPr>
-        <w:t>Kinobe</w:t>
-      </w:r>
-      <w:proofErr w:type="spellEnd"/>
-      <w:r>
-        <w:rPr>
-          <w:sz w:val="24"/>
-          <w:szCs w:val="24"/>
-          <w:lang w:val="en-US"/>
-        </w:rPr>
-        <w:t xml:space="preserve">, J. R., </w:t>
-      </w:r>
-      <w:proofErr w:type="spellStart"/>
-      <w:r>
-        <w:rPr>
-          <w:sz w:val="24"/>
-          <w:szCs w:val="24"/>
-          <w:lang w:val="en-US"/>
-        </w:rPr>
-        <w:t>Kasisira</w:t>
-      </w:r>
-      <w:proofErr w:type="spellEnd"/>
-      <w:r>
-        <w:rPr>
-          <w:sz w:val="24"/>
-          <w:szCs w:val="24"/>
-          <w:lang w:val="en-US"/>
-        </w:rPr>
-        <w:t xml:space="preserve">, L., Sundberg, C., </w:t>
-      </w:r>
-      <w:proofErr w:type="spellStart"/>
-      <w:r>
-        <w:rPr>
-          <w:sz w:val="24"/>
-          <w:szCs w:val="24"/>
-          <w:lang w:val="en-US"/>
-        </w:rPr>
-        <w:t>Gebresenbet</w:t>
-      </w:r>
-      <w:proofErr w:type="spellEnd"/>
-      <w:r>
-        <w:rPr>
-          <w:sz w:val="24"/>
-          <w:szCs w:val="24"/>
-          <w:lang w:val="en-US"/>
-        </w:rPr>
-        <w:t xml:space="preserve">, G., &amp; </w:t>
-      </w:r>
-      <w:proofErr w:type="spellStart"/>
-      <w:r>
-        <w:rPr>
-          <w:sz w:val="24"/>
-          <w:szCs w:val="24"/>
-          <w:lang w:val="en-US"/>
-        </w:rPr>
-        <w:t>Vinnerås</w:t>
-      </w:r>
-      <w:proofErr w:type="spellEnd"/>
-      <w:r>
-        <w:rPr>
-          <w:sz w:val="24"/>
-          <w:szCs w:val="24"/>
-          <w:lang w:val="en-US"/>
-        </w:rPr>
-        <w:t xml:space="preserve">, B. (2014). Characterization of municipal waste in Kampala, Uganda. </w:t>
+        <w:t xml:space="preserve">Komakech, A. J., Banadda, N. E., Kinobe, J. R., Kasisira, L., Sundberg, C., Gebresenbet, G., &amp; Vinnerås, B. (2014). Characterization of municipal waste in Kampala, Uganda. </w:t>
       </w:r>
       <w:r>
         <w:rPr>
@@ -15083,25 +14022,7 @@
           <w:szCs w:val="24"/>
           <w:lang w:val="en-US"/>
         </w:rPr>
-        <w:t xml:space="preserve">Komakech, A. J., Sundberg, C., Jönsson, H., &amp; </w:t>
-      </w:r>
-      <w:proofErr w:type="spellStart"/>
-      <w:r>
-        <w:rPr>
-          <w:sz w:val="24"/>
-          <w:szCs w:val="24"/>
-          <w:lang w:val="en-US"/>
-        </w:rPr>
-        <w:t>Vinnerås</w:t>
-      </w:r>
-      <w:proofErr w:type="spellEnd"/>
-      <w:r>
-        <w:rPr>
-          <w:sz w:val="24"/>
-          <w:szCs w:val="24"/>
-          <w:lang w:val="en-US"/>
-        </w:rPr>
-        <w:t>, B. (2015). Life cycle assessment of biodegradable waste treatment systems for sub-Saharan African cities. </w:t>
+        <w:t>Komakech, A. J., Sundberg, C., Jönsson, H., &amp; Vinnerås, B. (2015). Life cycle assessment of biodegradable waste treatment systems for sub-Saharan African cities. </w:t>
       </w:r>
       <w:r>
         <w:rPr>
@@ -15169,43 +14090,7 @@
           <w:szCs w:val="24"/>
           <w:lang w:val="en-US"/>
         </w:rPr>
-        <w:t xml:space="preserve">Komakech, A. J., </w:t>
-      </w:r>
-      <w:proofErr w:type="spellStart"/>
-      <w:r>
-        <w:rPr>
-          <w:sz w:val="24"/>
-          <w:szCs w:val="24"/>
-          <w:lang w:val="en-US"/>
-        </w:rPr>
-        <w:t>Zurbrügg</w:t>
-      </w:r>
-      <w:proofErr w:type="spellEnd"/>
-      <w:r>
-        <w:rPr>
-          <w:sz w:val="24"/>
-          <w:szCs w:val="24"/>
-          <w:lang w:val="en-US"/>
-        </w:rPr>
-        <w:t xml:space="preserve">, C., Miito, G. J., Wanyama, J., &amp; </w:t>
-      </w:r>
-      <w:proofErr w:type="spellStart"/>
-      <w:r>
-        <w:rPr>
-          <w:sz w:val="24"/>
-          <w:szCs w:val="24"/>
-          <w:lang w:val="en-US"/>
-        </w:rPr>
-        <w:t>Vinnerås</w:t>
-      </w:r>
-      <w:proofErr w:type="spellEnd"/>
-      <w:r>
-        <w:rPr>
-          <w:sz w:val="24"/>
-          <w:szCs w:val="24"/>
-          <w:lang w:val="en-US"/>
-        </w:rPr>
-        <w:t xml:space="preserve">, B. (2016). Environmental impact from vermicomposting of organic waste in Kampala, Uganda. </w:t>
+        <w:t xml:space="preserve">Komakech, A. J., Zurbrügg, C., Miito, G. J., Wanyama, J., &amp; Vinnerås, B. (2016). Environmental impact from vermicomposting of organic waste in Kampala, Uganda. </w:t>
       </w:r>
       <w:r>
         <w:rPr>
@@ -15282,61 +14167,7 @@
           <w:szCs w:val="24"/>
           <w:lang w:val="en-US"/>
         </w:rPr>
-        <w:t xml:space="preserve">Kupper, T., </w:t>
-      </w:r>
-      <w:proofErr w:type="spellStart"/>
-      <w:r>
-        <w:rPr>
-          <w:sz w:val="24"/>
-          <w:szCs w:val="24"/>
-          <w:lang w:val="en-US"/>
-        </w:rPr>
-        <w:t>Häni</w:t>
-      </w:r>
-      <w:proofErr w:type="spellEnd"/>
-      <w:r>
-        <w:rPr>
-          <w:sz w:val="24"/>
-          <w:szCs w:val="24"/>
-          <w:lang w:val="en-US"/>
-        </w:rPr>
-        <w:t xml:space="preserve">, C., </w:t>
-      </w:r>
-      <w:proofErr w:type="spellStart"/>
-      <w:r>
-        <w:rPr>
-          <w:sz w:val="24"/>
-          <w:szCs w:val="24"/>
-          <w:lang w:val="en-US"/>
-        </w:rPr>
-        <w:t>Neftel</w:t>
-      </w:r>
-      <w:proofErr w:type="spellEnd"/>
-      <w:r>
-        <w:rPr>
-          <w:sz w:val="24"/>
-          <w:szCs w:val="24"/>
-          <w:lang w:val="en-US"/>
-        </w:rPr>
-        <w:t xml:space="preserve">, A., Kincaid, C., Bühler, M., Amon, B., &amp; </w:t>
-      </w:r>
-      <w:proofErr w:type="spellStart"/>
-      <w:r>
-        <w:rPr>
-          <w:sz w:val="24"/>
-          <w:szCs w:val="24"/>
-          <w:lang w:val="en-US"/>
-        </w:rPr>
-        <w:t>VanderZaag</w:t>
-      </w:r>
-      <w:proofErr w:type="spellEnd"/>
-      <w:r>
-        <w:rPr>
-          <w:sz w:val="24"/>
-          <w:szCs w:val="24"/>
-          <w:lang w:val="en-US"/>
-        </w:rPr>
-        <w:t xml:space="preserve">, A. (2020). Ammonia and greenhouse gas emissions from slurry storage - A review. </w:t>
+        <w:t xml:space="preserve">Kupper, T., Häni, C., Neftel, A., Kincaid, C., Bühler, M., Amon, B., &amp; VanderZaag, A. (2020). Ammonia and greenhouse gas emissions from slurry storage - A review. </w:t>
       </w:r>
       <w:r>
         <w:rPr>
@@ -15416,25 +14247,7 @@
           <w:szCs w:val="24"/>
           <w:lang w:val="en-US"/>
         </w:rPr>
-        <w:t xml:space="preserve">Leitner, S., Pelster, D. E., Owino, J., Marquardt, S., &amp; </w:t>
-      </w:r>
-      <w:proofErr w:type="spellStart"/>
-      <w:r>
-        <w:rPr>
-          <w:sz w:val="24"/>
-          <w:szCs w:val="24"/>
-          <w:lang w:val="en-US"/>
-        </w:rPr>
-        <w:t>Merbold</w:t>
-      </w:r>
-      <w:proofErr w:type="spellEnd"/>
-      <w:r>
-        <w:rPr>
-          <w:sz w:val="24"/>
-          <w:szCs w:val="24"/>
-          <w:lang w:val="en-US"/>
-        </w:rPr>
-        <w:t xml:space="preserve">, L. (2020). </w:t>
+        <w:t xml:space="preserve">Leitner, S., Pelster, D. E., Owino, J., Marquardt, S., &amp; Merbold, L. (2020). </w:t>
       </w:r>
       <w:r>
         <w:rPr>
@@ -15499,69 +14312,12 @@
         </w:rPr>
         <w:t xml:space="preserve">Lim, S. L., Lee, L. H., &amp; Wu, T. Y. (2016). Sustainability of using composting and vermicomposting technologies for organic solid waste biotransformation: recent overview, greenhouse gases emissions and economic analysis. </w:t>
       </w:r>
-      <w:proofErr w:type="spellStart"/>
-      <w:r>
-        <w:rPr>
-          <w:sz w:val="24"/>
-          <w:szCs w:val="24"/>
-        </w:rPr>
-        <w:t>Journal</w:t>
-      </w:r>
-      <w:proofErr w:type="spellEnd"/>
-      <w:r>
-        <w:rPr>
-          <w:sz w:val="24"/>
-          <w:szCs w:val="24"/>
-        </w:rPr>
-        <w:t xml:space="preserve"> </w:t>
-      </w:r>
-      <w:proofErr w:type="spellStart"/>
-      <w:r>
-        <w:rPr>
-          <w:sz w:val="24"/>
-          <w:szCs w:val="24"/>
-        </w:rPr>
-        <w:t>of</w:t>
-      </w:r>
-      <w:proofErr w:type="spellEnd"/>
-      <w:r>
-        <w:rPr>
-          <w:sz w:val="24"/>
-          <w:szCs w:val="24"/>
-        </w:rPr>
-        <w:t xml:space="preserve"> </w:t>
-      </w:r>
-      <w:proofErr w:type="spellStart"/>
-      <w:r>
-        <w:rPr>
-          <w:sz w:val="24"/>
-          <w:szCs w:val="24"/>
-        </w:rPr>
-        <w:t>cleaner</w:t>
-      </w:r>
-      <w:proofErr w:type="spellEnd"/>
-      <w:r>
-        <w:rPr>
-          <w:sz w:val="24"/>
-          <w:szCs w:val="24"/>
-        </w:rPr>
-        <w:t xml:space="preserve"> </w:t>
-      </w:r>
-      <w:proofErr w:type="spellStart"/>
-      <w:r>
-        <w:rPr>
-          <w:sz w:val="24"/>
-          <w:szCs w:val="24"/>
-        </w:rPr>
-        <w:t>production</w:t>
-      </w:r>
-      <w:proofErr w:type="spellEnd"/>
-      <w:r>
-        <w:rPr>
-          <w:sz w:val="24"/>
-          <w:szCs w:val="24"/>
-        </w:rPr>
-        <w:t>, 111, 262-278.</w:t>
+      <w:r>
+        <w:rPr>
+          <w:sz w:val="24"/>
+          <w:szCs w:val="24"/>
+        </w:rPr>
+        <w:t>Journal of cleaner production, 111, 262-278.</w:t>
       </w:r>
     </w:p>
     <w:p>
@@ -15629,21 +14385,12 @@
           <w:szCs w:val="24"/>
         </w:rPr>
       </w:pPr>
-      <w:proofErr w:type="spellStart"/>
-      <w:r>
-        <w:rPr>
-          <w:sz w:val="24"/>
-          <w:szCs w:val="24"/>
-        </w:rPr>
-        <w:t>Macktoobian</w:t>
-      </w:r>
-      <w:proofErr w:type="spellEnd"/>
-      <w:r>
-        <w:rPr>
-          <w:sz w:val="24"/>
-          <w:szCs w:val="24"/>
-        </w:rPr>
-        <w:t>, M. (2024). </w:t>
+      <w:r>
+        <w:rPr>
+          <w:sz w:val="24"/>
+          <w:szCs w:val="24"/>
+        </w:rPr>
+        <w:t>Macktoobian, M. (2024). </w:t>
       </w:r>
       <w:r>
         <w:rPr>
@@ -15652,99 +14399,8 @@
           <w:sz w:val="24"/>
           <w:szCs w:val="24"/>
         </w:rPr>
-        <w:t xml:space="preserve">Life </w:t>
-      </w:r>
-      <w:proofErr w:type="spellStart"/>
-      <w:r>
-        <w:rPr>
-          <w:i/>
-          <w:iCs/>
-          <w:sz w:val="24"/>
-          <w:szCs w:val="24"/>
-        </w:rPr>
-        <w:t>cycle</w:t>
-      </w:r>
-      <w:proofErr w:type="spellEnd"/>
-      <w:r>
-        <w:rPr>
-          <w:i/>
-          <w:iCs/>
-          <w:sz w:val="24"/>
-          <w:szCs w:val="24"/>
-        </w:rPr>
-        <w:t xml:space="preserve"> </w:t>
-      </w:r>
-      <w:proofErr w:type="spellStart"/>
-      <w:r>
-        <w:rPr>
-          <w:i/>
-          <w:iCs/>
-          <w:sz w:val="24"/>
-          <w:szCs w:val="24"/>
-        </w:rPr>
-        <w:t>assessment</w:t>
-      </w:r>
-      <w:proofErr w:type="spellEnd"/>
-      <w:r>
-        <w:rPr>
-          <w:i/>
-          <w:iCs/>
-          <w:sz w:val="24"/>
-          <w:szCs w:val="24"/>
-        </w:rPr>
-        <w:t xml:space="preserve"> </w:t>
-      </w:r>
-      <w:proofErr w:type="spellStart"/>
-      <w:r>
-        <w:rPr>
-          <w:i/>
-          <w:iCs/>
-          <w:sz w:val="24"/>
-          <w:szCs w:val="24"/>
-        </w:rPr>
-        <w:t>of</w:t>
-      </w:r>
-      <w:proofErr w:type="spellEnd"/>
-      <w:r>
-        <w:rPr>
-          <w:i/>
-          <w:iCs/>
-          <w:sz w:val="24"/>
-          <w:szCs w:val="24"/>
-        </w:rPr>
-        <w:t xml:space="preserve"> </w:t>
-      </w:r>
-      <w:proofErr w:type="spellStart"/>
-      <w:r>
-        <w:rPr>
-          <w:i/>
-          <w:iCs/>
-          <w:sz w:val="24"/>
-          <w:szCs w:val="24"/>
-        </w:rPr>
-        <w:t>vermicomposting</w:t>
-      </w:r>
-      <w:proofErr w:type="spellEnd"/>
-      <w:r>
-        <w:rPr>
-          <w:i/>
-          <w:iCs/>
-          <w:sz w:val="24"/>
-          <w:szCs w:val="24"/>
-        </w:rPr>
-        <w:t xml:space="preserve"> </w:t>
-      </w:r>
-      <w:proofErr w:type="spellStart"/>
-      <w:r>
-        <w:rPr>
-          <w:i/>
-          <w:iCs/>
-          <w:sz w:val="24"/>
-          <w:szCs w:val="24"/>
-        </w:rPr>
-        <w:t>process</w:t>
-      </w:r>
-      <w:proofErr w:type="spellEnd"/>
+        <w:t>Life cycle assessment of vermicomposting process</w:t>
+      </w:r>
       <w:r>
         <w:rPr>
           <w:sz w:val="24"/>
@@ -15894,27 +14550,7 @@
           <w:sz w:val="24"/>
           <w:szCs w:val="24"/>
         </w:rPr>
-        <w:t xml:space="preserve"> </w:t>
-      </w:r>
-      <w:proofErr w:type="spellStart"/>
-      <w:r>
-        <w:rPr>
-          <w:i/>
-          <w:iCs/>
-          <w:sz w:val="24"/>
-          <w:szCs w:val="24"/>
-        </w:rPr>
-        <w:t>ed</w:t>
-      </w:r>
-      <w:proofErr w:type="spellEnd"/>
-      <w:r>
-        <w:rPr>
-          <w:i/>
-          <w:iCs/>
-          <w:sz w:val="24"/>
-          <w:szCs w:val="24"/>
-        </w:rPr>
-        <w:t>).</w:t>
+        <w:t xml:space="preserve"> ed).</w:t>
       </w:r>
       <w:r>
         <w:rPr>
@@ -15972,23 +14608,13 @@
           <w:lang w:val="en-US"/>
         </w:rPr>
       </w:pPr>
-      <w:proofErr w:type="spellStart"/>
       <w:r>
         <w:rPr>
           <w:sz w:val="24"/>
           <w:szCs w:val="24"/>
           <w:lang w:val="en-US"/>
         </w:rPr>
-        <w:t>Monteny</w:t>
-      </w:r>
-      <w:proofErr w:type="spellEnd"/>
-      <w:r>
-        <w:rPr>
-          <w:sz w:val="24"/>
-          <w:szCs w:val="24"/>
-          <w:lang w:val="en-US"/>
-        </w:rPr>
-        <w:t xml:space="preserve">, G. J., &amp; Erisman, J. W. (1998). </w:t>
+        <w:t xml:space="preserve">Monteny, G. J., &amp; Erisman, J. W. (1998). </w:t>
       </w:r>
       <w:r>
         <w:rPr>
@@ -16062,7 +14688,6 @@
         </w:rPr>
         <w:t>(2009). National Engineering Handbook-Part 651-Agricultural Waste Management Field Handbook. </w:t>
       </w:r>
-      <w:proofErr w:type="spellStart"/>
       <w:r>
         <w:rPr>
           <w:i/>
@@ -16070,77 +14695,7 @@
           <w:sz w:val="24"/>
           <w:szCs w:val="24"/>
         </w:rPr>
-        <w:t>United</w:t>
-      </w:r>
-      <w:proofErr w:type="spellEnd"/>
-      <w:r>
-        <w:rPr>
-          <w:i/>
-          <w:iCs/>
-          <w:sz w:val="24"/>
-          <w:szCs w:val="24"/>
-        </w:rPr>
-        <w:t xml:space="preserve"> States </w:t>
-      </w:r>
-      <w:proofErr w:type="spellStart"/>
-      <w:r>
-        <w:rPr>
-          <w:i/>
-          <w:iCs/>
-          <w:sz w:val="24"/>
-          <w:szCs w:val="24"/>
-        </w:rPr>
-        <w:t>Department</w:t>
-      </w:r>
-      <w:proofErr w:type="spellEnd"/>
-      <w:r>
-        <w:rPr>
-          <w:i/>
-          <w:iCs/>
-          <w:sz w:val="24"/>
-          <w:szCs w:val="24"/>
-        </w:rPr>
-        <w:t xml:space="preserve"> </w:t>
-      </w:r>
-      <w:proofErr w:type="spellStart"/>
-      <w:r>
-        <w:rPr>
-          <w:i/>
-          <w:iCs/>
-          <w:sz w:val="24"/>
-          <w:szCs w:val="24"/>
-        </w:rPr>
-        <w:t>of</w:t>
-      </w:r>
-      <w:proofErr w:type="spellEnd"/>
-      <w:r>
-        <w:rPr>
-          <w:i/>
-          <w:iCs/>
-          <w:sz w:val="24"/>
-          <w:szCs w:val="24"/>
-        </w:rPr>
-        <w:t xml:space="preserve"> </w:t>
-      </w:r>
-      <w:proofErr w:type="spellStart"/>
-      <w:r>
-        <w:rPr>
-          <w:i/>
-          <w:iCs/>
-          <w:sz w:val="24"/>
-          <w:szCs w:val="24"/>
-        </w:rPr>
-        <w:t>Agriculture</w:t>
-      </w:r>
-      <w:proofErr w:type="spellEnd"/>
-      <w:r>
-        <w:rPr>
-          <w:i/>
-          <w:iCs/>
-          <w:sz w:val="24"/>
-          <w:szCs w:val="24"/>
-        </w:rPr>
-        <w:t>: Washington, DC</w:t>
+        <w:t>United States Department of Agriculture: Washington, DC</w:t>
       </w:r>
       <w:r>
         <w:rPr>
@@ -16287,55 +14842,7 @@
           <w:sz w:val="24"/>
           <w:szCs w:val="24"/>
         </w:rPr>
-        <w:t>Rojas, L., &amp; Elizondo, J. (2020). Evaluación del efecto de los purines vacunos sobre la producción de pasto Taiwán (</w:t>
-      </w:r>
-      <w:proofErr w:type="spellStart"/>
-      <w:r>
-        <w:rPr>
-          <w:sz w:val="24"/>
-          <w:szCs w:val="24"/>
-        </w:rPr>
-        <w:t>Pennisetum</w:t>
-      </w:r>
-      <w:proofErr w:type="spellEnd"/>
-      <w:r>
-        <w:rPr>
-          <w:sz w:val="24"/>
-          <w:szCs w:val="24"/>
-        </w:rPr>
-        <w:t xml:space="preserve"> </w:t>
-      </w:r>
-      <w:proofErr w:type="spellStart"/>
-      <w:r>
-        <w:rPr>
-          <w:sz w:val="24"/>
-          <w:szCs w:val="24"/>
-        </w:rPr>
-        <w:t>purpureum</w:t>
-      </w:r>
-      <w:proofErr w:type="spellEnd"/>
-      <w:r>
-        <w:rPr>
-          <w:sz w:val="24"/>
-          <w:szCs w:val="24"/>
-        </w:rPr>
-        <w:t xml:space="preserve">) en un suelo </w:t>
-      </w:r>
-      <w:proofErr w:type="spellStart"/>
-      <w:r>
-        <w:rPr>
-          <w:sz w:val="24"/>
-          <w:szCs w:val="24"/>
-        </w:rPr>
-        <w:t>Andisol</w:t>
-      </w:r>
-      <w:proofErr w:type="spellEnd"/>
-      <w:r>
-        <w:rPr>
-          <w:sz w:val="24"/>
-          <w:szCs w:val="24"/>
-        </w:rPr>
-        <w:t xml:space="preserve">. </w:t>
+        <w:t xml:space="preserve">Rojas, L., &amp; Elizondo, J. (2020). Evaluación del efecto de los purines vacunos sobre la producción de pasto Taiwán (Pennisetum purpureum) en un suelo Andisol. </w:t>
       </w:r>
       <w:r>
         <w:rPr>
@@ -16416,9 +14923,8 @@
           <w:sz w:val="24"/>
           <w:szCs w:val="24"/>
         </w:rPr>
-        <w:t xml:space="preserve">Caracterización del abono orgánico resultante de dos metodologías de </w:t>
-      </w:r>
-      <w:proofErr w:type="spellStart"/>
+        <w:t xml:space="preserve">Caracterización del abono orgánico resultante de dos metodologías de vermicompostaje a partir de excretas de ganado vacuno mediante el uso de la lombriz roja californiana (Eisenia foetida) y su efecto sobre el crecimiento y desarrollo de plantas de </w:t>
+      </w:r>
       <w:r>
         <w:rPr>
           <w:i/>
@@ -16426,87 +14932,8 @@
           <w:sz w:val="24"/>
           <w:szCs w:val="24"/>
         </w:rPr>
-        <w:t>vermicompostaje</w:t>
-      </w:r>
-      <w:proofErr w:type="spellEnd"/>
-      <w:r>
-        <w:rPr>
-          <w:i/>
-          <w:iCs/>
-          <w:sz w:val="24"/>
-          <w:szCs w:val="24"/>
-        </w:rPr>
-        <w:t xml:space="preserve"> a partir de excretas de ganado vacuno mediante el uso de la lombriz roja californiana (</w:t>
-      </w:r>
-      <w:proofErr w:type="spellStart"/>
-      <w:r>
-        <w:rPr>
-          <w:i/>
-          <w:iCs/>
-          <w:sz w:val="24"/>
-          <w:szCs w:val="24"/>
-        </w:rPr>
-        <w:t>Eisenia</w:t>
-      </w:r>
-      <w:proofErr w:type="spellEnd"/>
-      <w:r>
-        <w:rPr>
-          <w:i/>
-          <w:iCs/>
-          <w:sz w:val="24"/>
-          <w:szCs w:val="24"/>
-        </w:rPr>
-        <w:t xml:space="preserve"> </w:t>
-      </w:r>
-      <w:proofErr w:type="spellStart"/>
-      <w:r>
-        <w:rPr>
-          <w:i/>
-          <w:iCs/>
-          <w:sz w:val="24"/>
-          <w:szCs w:val="24"/>
-        </w:rPr>
-        <w:t>foetida</w:t>
-      </w:r>
-      <w:proofErr w:type="spellEnd"/>
-      <w:r>
-        <w:rPr>
-          <w:i/>
-          <w:iCs/>
-          <w:sz w:val="24"/>
-          <w:szCs w:val="24"/>
-        </w:rPr>
-        <w:t xml:space="preserve">) y su efecto sobre el crecimiento y desarrollo de plantas de </w:t>
-      </w:r>
-      <w:r>
-        <w:rPr>
-          <w:i/>
-          <w:iCs/>
-          <w:sz w:val="24"/>
-          <w:szCs w:val="24"/>
-        </w:rPr>
         <w:lastRenderedPageBreak/>
-        <w:t xml:space="preserve">banano </w:t>
-      </w:r>
-      <w:proofErr w:type="spellStart"/>
-      <w:r>
-        <w:rPr>
-          <w:i/>
-          <w:iCs/>
-          <w:sz w:val="24"/>
-          <w:szCs w:val="24"/>
-        </w:rPr>
-        <w:t>cv</w:t>
-      </w:r>
-      <w:proofErr w:type="spellEnd"/>
-      <w:r>
-        <w:rPr>
-          <w:i/>
-          <w:iCs/>
-          <w:sz w:val="24"/>
-          <w:szCs w:val="24"/>
-        </w:rPr>
-        <w:t xml:space="preserve"> Gros Michel (Musa AAA) en invernadero </w:t>
+        <w:t xml:space="preserve">banano cv Gros Michel (Musa AAA) en invernadero </w:t>
       </w:r>
       <w:r>
         <w:rPr>
@@ -16673,39 +15100,8 @@
           <w:sz w:val="24"/>
           <w:szCs w:val="24"/>
         </w:rPr>
-        <w:t xml:space="preserve">Global </w:t>
-      </w:r>
-      <w:proofErr w:type="spellStart"/>
-      <w:r>
-        <w:rPr>
-          <w:i/>
-          <w:iCs/>
-          <w:sz w:val="24"/>
-          <w:szCs w:val="24"/>
-        </w:rPr>
-        <w:t>change</w:t>
-      </w:r>
-      <w:proofErr w:type="spellEnd"/>
-      <w:r>
-        <w:rPr>
-          <w:i/>
-          <w:iCs/>
-          <w:sz w:val="24"/>
-          <w:szCs w:val="24"/>
-        </w:rPr>
-        <w:t xml:space="preserve"> </w:t>
-      </w:r>
-      <w:proofErr w:type="spellStart"/>
-      <w:r>
-        <w:rPr>
-          <w:i/>
-          <w:iCs/>
-          <w:sz w:val="24"/>
-          <w:szCs w:val="24"/>
-        </w:rPr>
-        <w:t>biology</w:t>
-      </w:r>
-      <w:proofErr w:type="spellEnd"/>
+        <w:t>Global change biology</w:t>
+      </w:r>
       <w:r>
         <w:rPr>
           <w:sz w:val="24"/>
@@ -19470,23 +17866,7 @@
           <w:sz w:val="24"/>
           <w:szCs w:val="24"/>
         </w:rPr>
-        <w:t xml:space="preserve">aporte anual de nitrógeno vía </w:t>
-      </w:r>
-      <w:proofErr w:type="spellStart"/>
-      <w:r>
-        <w:rPr>
-          <w:sz w:val="24"/>
-          <w:szCs w:val="24"/>
-        </w:rPr>
-        <w:t>codigestación</w:t>
-      </w:r>
-      <w:proofErr w:type="spellEnd"/>
-      <w:r>
-        <w:rPr>
-          <w:sz w:val="24"/>
-          <w:szCs w:val="24"/>
-        </w:rPr>
-        <w:t xml:space="preserve"> en el país, kg N año</w:t>
+        <w:t>aporte anual de nitrógeno vía codigestación en el país, kg N año</w:t>
       </w:r>
       <w:r>
         <w:rPr>
@@ -21200,23 +19580,7 @@
           <w:sz w:val="24"/>
           <w:szCs w:val="24"/>
         </w:rPr>
-        <w:t xml:space="preserve">aporte anual de nitrógeno vía </w:t>
-      </w:r>
-      <w:proofErr w:type="spellStart"/>
-      <w:r>
-        <w:rPr>
-          <w:sz w:val="24"/>
-          <w:szCs w:val="24"/>
-        </w:rPr>
-        <w:t>codigestación</w:t>
-      </w:r>
-      <w:proofErr w:type="spellEnd"/>
-      <w:r>
-        <w:rPr>
-          <w:sz w:val="24"/>
-          <w:szCs w:val="24"/>
-        </w:rPr>
-        <w:t xml:space="preserve"> en el país, kg N año</w:t>
+        <w:t>aporte anual de nitrógeno vía codigestación en el país, kg N año</w:t>
       </w:r>
       <w:r>
         <w:rPr>
@@ -22894,23 +21258,7 @@
           <w:sz w:val="24"/>
           <w:szCs w:val="24"/>
         </w:rPr>
-        <w:t xml:space="preserve">aporte anual de nitrógeno vía </w:t>
-      </w:r>
-      <w:proofErr w:type="spellStart"/>
-      <w:r>
-        <w:rPr>
-          <w:sz w:val="24"/>
-          <w:szCs w:val="24"/>
-        </w:rPr>
-        <w:t>codigestación</w:t>
-      </w:r>
-      <w:proofErr w:type="spellEnd"/>
-      <w:r>
-        <w:rPr>
-          <w:sz w:val="24"/>
-          <w:szCs w:val="24"/>
-        </w:rPr>
-        <w:t xml:space="preserve"> en el país, kg N año</w:t>
+        <w:t>aporte anual de nitrógeno vía codigestación en el país, kg N año</w:t>
       </w:r>
       <w:r>
         <w:rPr>
@@ -34821,25 +33169,7 @@
           <w:sz w:val="24"/>
           <w:szCs w:val="24"/>
         </w:rPr>
-        <w:t xml:space="preserve">= Cantidad de nitrógeno de </w:t>
-      </w:r>
-      <w:proofErr w:type="spellStart"/>
-      <w:r>
-        <w:rPr>
-          <w:rFonts w:eastAsiaTheme="minorEastAsia"/>
-          <w:sz w:val="24"/>
-          <w:szCs w:val="24"/>
-        </w:rPr>
-        <w:t>codigestatos</w:t>
-      </w:r>
-      <w:proofErr w:type="spellEnd"/>
-      <w:r>
-        <w:rPr>
-          <w:rFonts w:eastAsiaTheme="minorEastAsia"/>
-          <w:sz w:val="24"/>
-          <w:szCs w:val="24"/>
-        </w:rPr>
-        <w:t xml:space="preserve"> añadidos a plantas de biogás, como desechos de alimentos o cultivos destinados a un fin específico, kg N año</w:t>
+        <w:t>= Cantidad de nitrógeno de codigestatos añadidos a plantas de biogás, como desechos de alimentos o cultivos destinados a un fin específico, kg N año</w:t>
       </w:r>
       <w:r>
         <w:rPr>
@@ -37768,7 +36098,6 @@
               </w:rPr>
             </w:pPr>
             <w:bookmarkStart w:id="9" w:name="_Hlk191471159"/>
-            <w:proofErr w:type="spellStart"/>
             <w:r>
               <w:rPr>
                 <w:color w:val="000000"/>
@@ -37778,7 +36107,6 @@
               </w:rPr>
               <w:t>Compuesto</w:t>
             </w:r>
-            <w:proofErr w:type="spellEnd"/>
           </w:p>
         </w:tc>
         <w:tc>
@@ -38368,7 +36696,6 @@
               </w:rPr>
               <w:t>(</w:t>
             </w:r>
-            <w:proofErr w:type="spellStart"/>
             <w:r>
               <w:rPr>
                 <w:rStyle w:val="Hyperlink"/>
@@ -38379,7 +36706,6 @@
               </w:rPr>
               <w:t>Ecobilan</w:t>
             </w:r>
-            <w:proofErr w:type="spellEnd"/>
             <w:r>
               <w:rPr>
                 <w:rStyle w:val="Hyperlink"/>
@@ -41909,28 +40235,28 @@
 </file>
 
 <file path=customXml/item1.xml><?xml version="1.0" encoding="utf-8"?>
-<b:Sources xmlns:b="http://schemas.openxmlformats.org/officeDocument/2006/bibliography" xmlns="http://schemas.openxmlformats.org/officeDocument/2006/bibliography" SelectedStyle="\APASixthEditionOfficeOnline.xsl" StyleName="APA" Version="6"/>
-</file>
-
-<file path=customXml/item2.xml><?xml version="1.0" encoding="utf-8"?>
 <go:gDocsCustomXmlDataStorage xmlns:go="http://customooxmlschemas.google.com/" xmlns:r="http://schemas.openxmlformats.org/officeDocument/2006/relationships" uri="GoogleDocsCustomDataVersion2">
   <go:docsCustomData xmlns:go="http://customooxmlschemas.google.com/" roundtripDataSignature="AMtx7mjz1q8q2d9L0vspV20xYiKQ5CxgHQ==">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</go:docsCustomData>
 </go:gDocsCustomXmlDataStorage>
 </file>
 
+<file path=customXml/item2.xml><?xml version="1.0" encoding="utf-8"?>
+<b:Sources xmlns:b="http://schemas.openxmlformats.org/officeDocument/2006/bibliography" xmlns="http://schemas.openxmlformats.org/officeDocument/2006/bibliography" SelectedStyle="\APASixthEditionOfficeOnline.xsl" StyleName="APA" Version="6"/>
+</file>
+
 <file path=customXml/itemProps1.xml><?xml version="1.0" encoding="utf-8"?>
-<ds:datastoreItem xmlns:ds="http://schemas.openxmlformats.org/officeDocument/2006/customXml" ds:itemID="{E18B4D62-2370-4B8D-B9C9-D9F88762DA47}">
+<ds:datastoreItem xmlns:ds="http://schemas.openxmlformats.org/officeDocument/2006/customXml" ds:itemID="{11111111-1234-1234-1234-123412341234}">
   <ds:schemaRefs>
-    <ds:schemaRef ds:uri="http://schemas.openxmlformats.org/officeDocument/2006/bibliography"/>
+    <ds:schemaRef ds:uri="http://customooxmlschemas.google.com/"/>
+    <ds:schemaRef ds:uri="http://schemas.openxmlformats.org/officeDocument/2006/relationships"/>
   </ds:schemaRefs>
 </ds:datastoreItem>
 </file>
 
 <file path=customXml/itemProps2.xml><?xml version="1.0" encoding="utf-8"?>
-<ds:datastoreItem xmlns:ds="http://schemas.openxmlformats.org/officeDocument/2006/customXml" ds:itemID="{11111111-1234-1234-1234-123412341234}">
+<ds:datastoreItem xmlns:ds="http://schemas.openxmlformats.org/officeDocument/2006/customXml" ds:itemID="{E18B4D62-2370-4B8D-B9C9-D9F88762DA47}">
   <ds:schemaRefs>
-    <ds:schemaRef ds:uri="http://customooxmlschemas.google.com/"/>
-    <ds:schemaRef ds:uri="http://schemas.openxmlformats.org/officeDocument/2006/relationships"/>
+    <ds:schemaRef ds:uri="http://schemas.openxmlformats.org/officeDocument/2006/bibliography"/>
   </ds:schemaRefs>
 </ds:datastoreItem>
 </file>

</xml_diff>